<commit_message>
feat(main): add model training and inference for transformer-based translation
</commit_message>
<xml_diff>
--- a/Year 1/Природно-надійні системи кібербезпеки/Звіт_4.docx
+++ b/Year 1/Природно-надійні системи кібербезпеки/Звіт_4.docx
@@ -336,7 +336,7 @@
           <w:b/>
           <w:sz w:val="28"/>
           <w:szCs w:val="28"/>
-          <w:lang w:val="uk-UA"/>
+          <w:lang w:val="en-US"/>
         </w:rPr>
       </w:pPr>
       <w:r>
@@ -355,7 +355,7 @@
           <w:b/>
           <w:sz w:val="28"/>
           <w:szCs w:val="28"/>
-          <w:lang w:val="uk-UA"/>
+          <w:lang w:val="en-US"/>
         </w:rPr>
         <w:t>4</w:t>
       </w:r>
@@ -416,39 +416,33 @@
       <w:proofErr w:type="spellStart"/>
       <w:r>
         <w:rPr>
-          <w:rFonts w:eastAsiaTheme="minorHAnsi"/>
-          <w:b/>
-          <w:bCs/>
-          <w:color w:val="000000"/>
-          <w:sz w:val="28"/>
-          <w:szCs w:val="28"/>
-          <w:lang w:val="uk-UA" w:eastAsia="en-US"/>
-          <w14:ligatures w14:val="standardContextual"/>
-        </w:rPr>
-        <w:t>Нейромережа</w:t>
-      </w:r>
-      <w:proofErr w:type="spellEnd"/>
-      <w:r>
-        <w:rPr>
-          <w:rFonts w:eastAsiaTheme="minorHAnsi"/>
-          <w:b/>
-          <w:bCs/>
-          <w:color w:val="000000"/>
-          <w:sz w:val="28"/>
-          <w:szCs w:val="28"/>
-          <w:lang w:val="uk-UA" w:eastAsia="en-US"/>
-          <w14:ligatures w14:val="standardContextual"/>
-        </w:rPr>
-        <w:t xml:space="preserve"> Seq2seq на основі GRU для шифрування інформації.</w:t>
-      </w:r>
-      <w:r>
-        <w:rPr>
           <w:rFonts w:ascii="Times New Roman CYR" w:hAnsi="Times New Roman CYR"/>
           <w:b/>
           <w:sz w:val="28"/>
           <w:szCs w:val="28"/>
           <w:lang w:val="uk-UA"/>
         </w:rPr>
+        <w:t>Нейромережа</w:t>
+      </w:r>
+      <w:proofErr w:type="spellEnd"/>
+      <w:r>
+        <w:rPr>
+          <w:rFonts w:ascii="Times New Roman CYR" w:hAnsi="Times New Roman CYR"/>
+          <w:b/>
+          <w:sz w:val="28"/>
+          <w:szCs w:val="28"/>
+          <w:lang w:val="uk-UA"/>
+        </w:rPr>
+        <w:t xml:space="preserve"> Seq2seq на основі GRU для шифрування інформації.</w:t>
+      </w:r>
+      <w:r>
+        <w:rPr>
+          <w:rFonts w:ascii="Times New Roman CYR" w:hAnsi="Times New Roman CYR"/>
+          <w:b/>
+          <w:sz w:val="28"/>
+          <w:szCs w:val="28"/>
+          <w:lang w:val="uk-UA"/>
+        </w:rPr>
         <w:t>”</w:t>
       </w:r>
     </w:p>
@@ -827,7 +821,7 @@
         <w:jc w:val="center"/>
         <w:rPr>
           <w:rFonts w:ascii="Times New Roman CYR" w:hAnsi="Times New Roman CYR"/>
-          <w:lang w:val="uk-UA"/>
+          <w:lang w:val="en-US"/>
         </w:rPr>
       </w:pPr>
       <w:r>
@@ -840,7 +834,7 @@
       <w:r>
         <w:rPr>
           <w:rFonts w:ascii="Times New Roman CYR" w:hAnsi="Times New Roman CYR"/>
-          <w:lang w:val="uk-UA"/>
+          <w:lang w:val="en-US"/>
         </w:rPr>
         <w:t>4</w:t>
       </w:r>
@@ -852,7 +846,6 @@
         <w:rPr>
           <w:rFonts w:ascii="Times New Roman CYR" w:hAnsi="Times New Roman CYR"/>
           <w:b/>
-          <w:i/>
           <w:lang w:val="uk-UA"/>
         </w:rPr>
       </w:pPr>
@@ -874,6 +867,7 @@
       <w:proofErr w:type="spellStart"/>
       <w:r>
         <w:rPr>
+          <w:rFonts w:ascii="Times New Roman CYR" w:hAnsi="Times New Roman CYR"/>
           <w:b/>
           <w:lang w:val="uk-UA"/>
         </w:rPr>
@@ -882,6 +876,7 @@
       <w:proofErr w:type="spellEnd"/>
       <w:r>
         <w:rPr>
+          <w:rFonts w:ascii="Times New Roman CYR" w:hAnsi="Times New Roman CYR"/>
           <w:b/>
           <w:lang w:val="uk-UA"/>
         </w:rPr>
@@ -898,263 +893,181 @@
     </w:p>
     <w:p>
       <w:pPr>
+        <w:pStyle w:val="ListParagraph"/>
         <w:numPr>
           <w:ilvl w:val="0"/>
-          <w:numId w:val="1"/>
+          <w:numId w:val="19"/>
         </w:numPr>
         <w:spacing w:line="360" w:lineRule="auto"/>
-        <w:ind w:left="360" w:firstLine="349"/>
-        <w:jc w:val="both"/>
-        <w:rPr>
-          <w:lang w:val="uk-UA"/>
-        </w:rPr>
-      </w:pPr>
-      <w:r>
-        <w:rPr>
+        <w:rPr>
+          <w:rFonts w:ascii="Times New Roman CYR" w:hAnsi="Times New Roman CYR"/>
           <w:b/>
+          <w:i/>
+          <w:lang w:val="uk-UA"/>
+        </w:rPr>
+      </w:pPr>
+      <w:r>
+        <w:rPr>
+          <w:rFonts w:ascii="Times New Roman CYR" w:hAnsi="Times New Roman CYR"/>
+          <w:b/>
+          <w:i/>
+          <w:lang w:val="uk-UA"/>
+        </w:rPr>
+        <w:t>Мета роботи:</w:t>
+      </w:r>
+      <w:r>
+        <w:rPr>
+          <w:rFonts w:ascii="Times New Roman CYR" w:hAnsi="Times New Roman CYR"/>
+          <w:b/>
+          <w:i/>
+          <w:lang w:val="uk-UA"/>
+        </w:rPr>
+        <w:t xml:space="preserve"> </w:t>
+      </w:r>
+      <w:r>
+        <w:rPr>
+          <w:rFonts w:ascii="Times New Roman CYR" w:hAnsi="Times New Roman CYR"/>
           <w:bCs/>
           <w:i/>
           <w:lang w:val="uk-UA"/>
         </w:rPr>
-        <w:t>Мета роботи</w:t>
-      </w:r>
-      <w:r>
-        <w:rPr>
-          <w:lang w:val="uk-UA"/>
-        </w:rPr>
-        <w:t xml:space="preserve">: </w:t>
-      </w:r>
-      <w:r>
-        <w:rPr>
-          <w:lang w:val="uk-UA"/>
-        </w:rPr>
-        <w:t>Дослідити та реалізувати архітектуру Seq2seq на основі рекурентних шарів з довгою короткочасною пам'яттю (LSTM) для задачі машинного перекладу.</w:t>
+        <w:t>Дослідити та реалізувати архітектуру Seq2seq на основі рекурентних шарів з керованими вентилями (GRU) для задачі машинного перекладу</w:t>
+      </w:r>
+      <w:r>
+        <w:rPr>
+          <w:rFonts w:ascii="Times New Roman CYR" w:hAnsi="Times New Roman CYR"/>
+          <w:bCs/>
+          <w:i/>
+          <w:lang w:val="uk-UA"/>
+        </w:rPr>
+        <w:t>.</w:t>
       </w:r>
     </w:p>
     <w:p>
       <w:pPr>
         <w:numPr>
           <w:ilvl w:val="0"/>
-          <w:numId w:val="1"/>
+          <w:numId w:val="19"/>
         </w:numPr>
         <w:spacing w:line="360" w:lineRule="auto"/>
         <w:rPr>
-          <w:lang w:val="uk-UA"/>
-        </w:rPr>
-      </w:pPr>
-      <w:r>
-        <w:rPr>
           <w:b/>
-          <w:bCs/>
-          <w:i/>
-          <w:lang w:val="uk-UA"/>
-        </w:rPr>
-        <w:t>Завдання для виконання</w:t>
-      </w:r>
-      <w:r>
-        <w:rPr>
-          <w:lang w:val="uk-UA"/>
-        </w:rPr>
-        <w:t>:</w:t>
+          <w:i/>
+          <w:lang w:val="uk-UA"/>
+        </w:rPr>
+      </w:pPr>
+      <w:r>
+        <w:rPr>
+          <w:b/>
+          <w:i/>
+          <w:lang w:val="uk-UA"/>
+        </w:rPr>
+        <w:t>Завдання для виконання:</w:t>
       </w:r>
     </w:p>
     <w:p>
       <w:pPr>
-        <w:pStyle w:val="NormalWeb"/>
+        <w:pStyle w:val="Normal15"/>
         <w:numPr>
           <w:ilvl w:val="1"/>
-          <w:numId w:val="17"/>
+          <w:numId w:val="19"/>
         </w:numPr>
-        <w:spacing w:before="0" w:beforeAutospacing="0" w:after="0" w:afterAutospacing="0" w:line="360" w:lineRule="auto"/>
-        <w:jc w:val="both"/>
-        <w:rPr>
-          <w:lang w:val="uk-UA"/>
-        </w:rPr>
-      </w:pPr>
-      <w:r>
-        <w:rPr>
-          <w:lang w:val="uk-UA"/>
-        </w:rPr>
-        <w:t xml:space="preserve">Реалізувати модель </w:t>
-      </w:r>
-      <w:proofErr w:type="spellStart"/>
-      <w:r>
-        <w:rPr>
-          <w:lang w:val="uk-UA"/>
-        </w:rPr>
-        <w:t>Encoder-Decoder</w:t>
-      </w:r>
-      <w:proofErr w:type="spellEnd"/>
-      <w:r>
-        <w:rPr>
-          <w:lang w:val="uk-UA"/>
-        </w:rPr>
-        <w:t xml:space="preserve">, де </w:t>
-      </w:r>
-      <w:proofErr w:type="spellStart"/>
-      <w:r>
-        <w:rPr>
-          <w:lang w:val="uk-UA"/>
-        </w:rPr>
-        <w:t>кодер</w:t>
-      </w:r>
-      <w:proofErr w:type="spellEnd"/>
-      <w:r>
-        <w:rPr>
-          <w:lang w:val="uk-UA"/>
-        </w:rPr>
-        <w:t xml:space="preserve"> та декодер побудовані на шарах </w:t>
+      </w:pPr>
+      <w:r>
+        <w:t xml:space="preserve">Реалізувати модель Encoder-Decoder, де кодер та декодер побудовані на шарах </w:t>
       </w:r>
       <w:r>
         <w:rPr>
           <w:rStyle w:val="HTMLCode"/>
-          <w:rFonts w:eastAsiaTheme="majorEastAsia"/>
-          <w:lang w:val="uk-UA"/>
-        </w:rPr>
-        <w:t>LSTM</w:t>
-      </w:r>
-      <w:r>
-        <w:rPr>
-          <w:lang w:val="uk-UA"/>
-        </w:rPr>
+          <w:rFonts w:ascii="Times New Roman" w:eastAsiaTheme="majorEastAsia" w:hAnsi="Times New Roman" w:cs="Times New Roman"/>
+          <w:sz w:val="24"/>
+          <w:szCs w:val="24"/>
+        </w:rPr>
+        <w:t>GRU</w:t>
+      </w:r>
+      <w:r>
         <w:t>.</w:t>
       </w:r>
     </w:p>
     <w:p>
       <w:pPr>
-        <w:pStyle w:val="NormalWeb"/>
+        <w:pStyle w:val="Normal15"/>
         <w:numPr>
           <w:ilvl w:val="1"/>
-          <w:numId w:val="17"/>
+          <w:numId w:val="19"/>
         </w:numPr>
-        <w:spacing w:before="0" w:beforeAutospacing="0" w:after="0" w:afterAutospacing="0" w:line="360" w:lineRule="auto"/>
-        <w:jc w:val="both"/>
-        <w:rPr>
-          <w:lang w:val="uk-UA"/>
-        </w:rPr>
-      </w:pPr>
-      <w:r>
-        <w:rPr>
-          <w:lang w:val="uk-UA"/>
-        </w:rPr>
-        <w:t xml:space="preserve">Підготувати та </w:t>
-      </w:r>
-      <w:proofErr w:type="spellStart"/>
-      <w:r>
-        <w:rPr>
-          <w:lang w:val="uk-UA"/>
-        </w:rPr>
-        <w:t>векторизувати</w:t>
-      </w:r>
-      <w:proofErr w:type="spellEnd"/>
-      <w:r>
-        <w:rPr>
-          <w:lang w:val="uk-UA"/>
-        </w:rPr>
-        <w:t xml:space="preserve"> текстові дані (франко-англійський паралельний корпус).</w:t>
+      </w:pPr>
+      <w:r>
+        <w:t>Підготувати та векторизувати текстові дані (франко-англійський паралельний корпус).</w:t>
       </w:r>
     </w:p>
     <w:p>
       <w:pPr>
-        <w:pStyle w:val="NormalWeb"/>
+        <w:pStyle w:val="Normal15"/>
         <w:numPr>
           <w:ilvl w:val="1"/>
-          <w:numId w:val="17"/>
+          <w:numId w:val="19"/>
         </w:numPr>
-        <w:spacing w:before="0" w:beforeAutospacing="0" w:after="0" w:afterAutospacing="0" w:line="360" w:lineRule="auto"/>
-        <w:jc w:val="both"/>
-        <w:rPr>
-          <w:lang w:val="uk-UA"/>
-        </w:rPr>
-      </w:pPr>
-      <w:r>
-        <w:rPr>
-          <w:lang w:val="uk-UA"/>
-        </w:rPr>
-        <w:t>Обрати на підставі номеру варіанту (Варіант 1) кількість ітерацій (</w:t>
-      </w:r>
-      <w:proofErr w:type="spellStart"/>
+      </w:pPr>
+      <w:r>
+        <w:t>Обрати на підставі номеру варіанту кількість ітерацій (</w:t>
+      </w:r>
       <w:r>
         <w:rPr>
           <w:rStyle w:val="HTMLCode"/>
-          <w:rFonts w:eastAsiaTheme="majorEastAsia"/>
-          <w:lang w:val="uk-UA"/>
+          <w:rFonts w:ascii="Times New Roman" w:eastAsiaTheme="majorEastAsia" w:hAnsi="Times New Roman" w:cs="Times New Roman"/>
+          <w:sz w:val="24"/>
+          <w:szCs w:val="24"/>
         </w:rPr>
         <w:t>epochs</w:t>
       </w:r>
-      <w:proofErr w:type="spellEnd"/>
-      <w:r>
-        <w:rPr>
-          <w:lang w:val="uk-UA"/>
-        </w:rPr>
+      <w:r>
         <w:t>) для навчання.</w:t>
       </w:r>
     </w:p>
     <w:p>
       <w:pPr>
-        <w:pStyle w:val="NormalWeb"/>
+        <w:pStyle w:val="Normal15"/>
         <w:numPr>
           <w:ilvl w:val="1"/>
-          <w:numId w:val="17"/>
+          <w:numId w:val="19"/>
         </w:numPr>
-        <w:spacing w:before="0" w:beforeAutospacing="0" w:after="0" w:afterAutospacing="0" w:line="360" w:lineRule="auto"/>
-        <w:jc w:val="both"/>
-        <w:rPr>
-          <w:lang w:val="uk-UA"/>
-        </w:rPr>
-      </w:pPr>
-      <w:r>
-        <w:rPr>
-          <w:lang w:val="uk-UA"/>
-        </w:rPr>
-        <w:t xml:space="preserve">Навчити модель та порівняти її продуктивність з моделями на базі </w:t>
-      </w:r>
-      <w:proofErr w:type="spellStart"/>
+        <w:rPr>
+          <w:lang w:val="uk-UA"/>
+        </w:rPr>
+      </w:pPr>
+      <w:r>
+        <w:t xml:space="preserve">Навчити модель та порівняти її продуктивність (якість "дешифрування") з моделлю на базі </w:t>
+      </w:r>
       <w:r>
         <w:rPr>
           <w:rStyle w:val="HTMLCode"/>
-          <w:rFonts w:eastAsiaTheme="majorEastAsia"/>
-          <w:lang w:val="uk-UA"/>
+          <w:rFonts w:ascii="Times New Roman" w:eastAsiaTheme="majorEastAsia" w:hAnsi="Times New Roman" w:cs="Times New Roman"/>
+          <w:sz w:val="24"/>
+          <w:szCs w:val="24"/>
         </w:rPr>
         <w:t>SimpleRNN</w:t>
       </w:r>
-      <w:proofErr w:type="spellEnd"/>
-      <w:r>
-        <w:rPr>
-          <w:lang w:val="uk-UA"/>
-        </w:rPr>
-        <w:t xml:space="preserve"> та </w:t>
-      </w:r>
-      <w:r>
-        <w:rPr>
-          <w:rStyle w:val="HTMLCode"/>
-          <w:rFonts w:eastAsiaTheme="majorEastAsia"/>
-          <w:lang w:val="uk-UA"/>
-        </w:rPr>
-        <w:t>GRU</w:t>
-      </w:r>
-      <w:r>
-        <w:rPr>
-          <w:lang w:val="uk-UA"/>
-        </w:rPr>
-        <w:t>.</w:t>
+      <w:r>
+        <w:t xml:space="preserve"> з попередньої лабораторної роботи.</w:t>
       </w:r>
     </w:p>
     <w:p>
       <w:pPr>
         <w:numPr>
           <w:ilvl w:val="0"/>
-          <w:numId w:val="1"/>
+          <w:numId w:val="19"/>
         </w:numPr>
         <w:spacing w:line="360" w:lineRule="auto"/>
         <w:rPr>
-          <w:lang w:val="uk-UA"/>
-        </w:rPr>
-      </w:pPr>
-      <w:r>
-        <w:rPr>
           <w:b/>
-          <w:bCs/>
+          <w:i/>
+          <w:lang w:val="uk-UA"/>
+        </w:rPr>
+      </w:pPr>
+      <w:r>
+        <w:rPr>
+          <w:b/>
           <w:i/>
           <w:lang w:val="uk-UA"/>
         </w:rPr>
@@ -1163,1022 +1076,1772 @@
       <w:r>
         <w:rPr>
           <w:b/>
-          <w:bCs/>
-          <w:lang w:val="uk-UA"/>
-        </w:rPr>
-        <w:t>.</w:t>
+          <w:i/>
+          <w:lang w:val="en-US"/>
+        </w:rPr>
+        <w:t>:</w:t>
       </w:r>
     </w:p>
     <w:p>
       <w:pPr>
         <w:pStyle w:val="CodeBlock"/>
         <w:rPr>
-          <w:lang w:val="uk-UA"/>
-        </w:rPr>
-      </w:pPr>
-      <w:r>
-        <w:rPr>
-          <w:lang w:val="uk-UA"/>
-        </w:rPr>
-        <w:t>import numpy</w:t>
-      </w:r>
-      <w:r>
-        <w:rPr>
-          <w:lang w:val="uk-UA"/>
-        </w:rPr>
-        <w:br/>
-        <w:t>import tensorflow</w:t>
-      </w:r>
-      <w:r>
-        <w:rPr>
-          <w:lang w:val="uk-UA"/>
-        </w:rPr>
-        <w:br/>
-      </w:r>
-      <w:r>
-        <w:rPr>
-          <w:lang w:val="uk-UA"/>
-        </w:rPr>
-        <w:br/>
+          <w:lang w:val="en-UA"/>
+        </w:rPr>
+      </w:pPr>
+      <w:r>
+        <w:rPr>
+          <w:i/>
+          <w:iCs/>
+        </w:rPr>
+        <w:t xml:space="preserve">import </w:t>
+      </w:r>
+      <w:r>
+        <w:t>numpy</w:t>
+      </w:r>
+      <w:r>
+        <w:br/>
+      </w:r>
+      <w:r>
+        <w:rPr>
+          <w:i/>
+          <w:iCs/>
+        </w:rPr>
+        <w:t xml:space="preserve">import </w:t>
+      </w:r>
+      <w:r>
+        <w:t>tensorflow</w:t>
+      </w:r>
+      <w:r>
+        <w:br/>
+      </w:r>
+      <w:r>
+        <w:br/>
+      </w:r>
+      <w:r>
+        <w:rPr>
+          <w:i/>
+          <w:iCs/>
+        </w:rPr>
+        <w:t># Параметри моделі</w:t>
+      </w:r>
+      <w:r>
+        <w:rPr>
+          <w:i/>
+          <w:iCs/>
+        </w:rPr>
+        <w:br/>
+      </w:r>
+      <w:r>
         <w:t>batch_size = 64</w:t>
       </w:r>
       <w:r>
-        <w:rPr>
-          <w:lang w:val="uk-UA"/>
-        </w:rPr>
-        <w:br/>
-        <w:t>n = 50</w:t>
-      </w:r>
-      <w:r>
-        <w:rPr>
-          <w:lang w:val="uk-UA"/>
-        </w:rPr>
-        <w:br/>
+        <w:br/>
+        <w:t xml:space="preserve">n = 50 </w:t>
+      </w:r>
+      <w:r>
+        <w:rPr>
+          <w:i/>
+          <w:iCs/>
+        </w:rPr>
+        <w:t># Встановлено 50 епох для адекватного навчання</w:t>
+      </w:r>
+      <w:r>
+        <w:rPr>
+          <w:i/>
+          <w:iCs/>
+        </w:rPr>
+        <w:br/>
+      </w:r>
+      <w:r>
         <w:t>latent_dim = 256</w:t>
       </w:r>
       <w:r>
-        <w:rPr>
-          <w:lang w:val="uk-UA"/>
-        </w:rPr>
         <w:br/>
         <w:t>num_samples = 1000</w:t>
       </w:r>
       <w:r>
-        <w:rPr>
-          <w:lang w:val="uk-UA"/>
-        </w:rPr>
-        <w:br/>
-      </w:r>
-      <w:r>
-        <w:rPr>
-          <w:lang w:val="uk-UA"/>
-        </w:rPr>
-        <w:br/>
+        <w:br/>
+      </w:r>
+      <w:r>
+        <w:br/>
+      </w:r>
+      <w:r>
+        <w:rPr>
+          <w:i/>
+          <w:iCs/>
+        </w:rPr>
+        <w:t># Списки для збереження даних</w:t>
+      </w:r>
+      <w:r>
+        <w:rPr>
+          <w:i/>
+          <w:iCs/>
+        </w:rPr>
+        <w:br/>
+      </w:r>
+      <w:r>
         <w:t>input_texts = []</w:t>
       </w:r>
       <w:r>
-        <w:rPr>
-          <w:lang w:val="uk-UA"/>
-        </w:rPr>
         <w:br/>
         <w:t>target_texts = []</w:t>
       </w:r>
       <w:r>
-        <w:rPr>
-          <w:lang w:val="uk-UA"/>
-        </w:rPr>
-        <w:br/>
-        <w:t>input_characters = set()</w:t>
-      </w:r>
-      <w:r>
-        <w:rPr>
-          <w:lang w:val="uk-UA"/>
-        </w:rPr>
-        <w:br/>
-        <w:t>target_characters = set()</w:t>
-      </w:r>
-      <w:r>
-        <w:rPr>
-          <w:lang w:val="uk-UA"/>
-        </w:rPr>
-        <w:br/>
-      </w:r>
-      <w:r>
-        <w:rPr>
-          <w:lang w:val="uk-UA"/>
-        </w:rPr>
-        <w:br/>
-        <w:t>with open("fra-eng/fra.txt", "r", encoding="utf-8") as f:</w:t>
-      </w:r>
-      <w:r>
-        <w:rPr>
-          <w:lang w:val="uk-UA"/>
-        </w:rPr>
+        <w:br/>
+        <w:t xml:space="preserve">input_characters = </w:t>
+      </w:r>
+      <w:r>
+        <w:rPr>
+          <w:i/>
+          <w:iCs/>
+        </w:rPr>
+        <w:t>set</w:t>
+      </w:r>
+      <w:r>
+        <w:t>()</w:t>
+      </w:r>
+      <w:r>
+        <w:br/>
+        <w:t xml:space="preserve">target_characters = </w:t>
+      </w:r>
+      <w:r>
+        <w:rPr>
+          <w:i/>
+          <w:iCs/>
+        </w:rPr>
+        <w:t>set</w:t>
+      </w:r>
+      <w:r>
+        <w:t>()</w:t>
+      </w:r>
+      <w:r>
+        <w:br/>
+      </w:r>
+      <w:r>
+        <w:br/>
+      </w:r>
+      <w:r>
+        <w:rPr>
+          <w:i/>
+          <w:iCs/>
+        </w:rPr>
+        <w:t># Читання та підготовка даних</w:t>
+      </w:r>
+      <w:r>
+        <w:rPr>
+          <w:i/>
+          <w:iCs/>
+        </w:rPr>
+        <w:br/>
+        <w:t>with open</w:t>
+      </w:r>
+      <w:r>
+        <w:t xml:space="preserve">("fra-eng/fra.txt", "r", encoding="utf-8") </w:t>
+      </w:r>
+      <w:r>
+        <w:rPr>
+          <w:i/>
+          <w:iCs/>
+        </w:rPr>
+        <w:t xml:space="preserve">as </w:t>
+      </w:r>
+      <w:r>
+        <w:t>f:</w:t>
+      </w:r>
+      <w:r>
         <w:br/>
         <w:t xml:space="preserve">    lines = f.read().split("\n")</w:t>
       </w:r>
       <w:r>
-        <w:rPr>
-          <w:lang w:val="uk-UA"/>
-        </w:rPr>
-        <w:br/>
-      </w:r>
-      <w:r>
-        <w:rPr>
-          <w:lang w:val="uk-UA"/>
-        </w:rPr>
-        <w:br/>
-        <w:t>for line in lines[: min(num_samples, len(lines) - 1)]:</w:t>
-      </w:r>
-      <w:r>
-        <w:rPr>
-          <w:lang w:val="uk-UA"/>
-        </w:rPr>
-        <w:br/>
-        <w:t xml:space="preserve">    input_text, target_text, _ = line.split("\t")</w:t>
-      </w:r>
-      <w:r>
-        <w:rPr>
-          <w:lang w:val="uk-UA"/>
-        </w:rPr>
-        <w:br/>
-        <w:t xml:space="preserve">    target_text = "\t" + target_text + "\n"</w:t>
-      </w:r>
-      <w:r>
-        <w:rPr>
-          <w:lang w:val="uk-UA"/>
-        </w:rPr>
+        <w:br/>
+      </w:r>
+      <w:r>
+        <w:br/>
+      </w:r>
+      <w:r>
+        <w:rPr>
+          <w:i/>
+          <w:iCs/>
+        </w:rPr>
+        <w:t xml:space="preserve">for </w:t>
+      </w:r>
+      <w:r>
+        <w:t xml:space="preserve">line </w:t>
+      </w:r>
+      <w:r>
+        <w:rPr>
+          <w:i/>
+          <w:iCs/>
+        </w:rPr>
+        <w:t xml:space="preserve">in </w:t>
+      </w:r>
+      <w:r>
+        <w:t xml:space="preserve">lines[: </w:t>
+      </w:r>
+      <w:r>
+        <w:rPr>
+          <w:i/>
+          <w:iCs/>
+        </w:rPr>
+        <w:t>min</w:t>
+      </w:r>
+      <w:r>
+        <w:t xml:space="preserve">(num_samples, </w:t>
+      </w:r>
+      <w:r>
+        <w:rPr>
+          <w:i/>
+          <w:iCs/>
+        </w:rPr>
+        <w:t>len</w:t>
+      </w:r>
+      <w:r>
+        <w:t>(lines) - 1)]:</w:t>
+      </w:r>
+      <w:r>
+        <w:br/>
+        <w:t xml:space="preserve">    </w:t>
+      </w:r>
+      <w:r>
+        <w:rPr>
+          <w:i/>
+          <w:iCs/>
+        </w:rPr>
+        <w:t># Розділяємо рядок; ігноруємо третій елемент (ліцензія)</w:t>
+      </w:r>
+      <w:r>
+        <w:rPr>
+          <w:i/>
+          <w:iCs/>
+        </w:rPr>
+        <w:br/>
+        <w:t xml:space="preserve">    </w:t>
+      </w:r>
+      <w:r>
+        <w:t>input_text, target_text, _ = line.split("\t")</w:t>
+      </w:r>
+      <w:r>
+        <w:br/>
+        <w:t xml:space="preserve">    </w:t>
+      </w:r>
+      <w:r>
+        <w:rPr>
+          <w:i/>
+          <w:iCs/>
+        </w:rPr>
+        <w:t># Додаємо токени початку (start) та кінця (end) до цільового тексту</w:t>
+      </w:r>
+      <w:r>
+        <w:rPr>
+          <w:i/>
+          <w:iCs/>
+        </w:rPr>
+        <w:br/>
+        <w:t xml:space="preserve">    </w:t>
+      </w:r>
+      <w:r>
+        <w:t>target_text = "\t" + target_text + "\n"</w:t>
+      </w:r>
+      <w:r>
         <w:br/>
         <w:t xml:space="preserve">    input_texts.append(input_text)</w:t>
       </w:r>
       <w:r>
-        <w:rPr>
-          <w:lang w:val="uk-UA"/>
-        </w:rPr>
         <w:br/>
         <w:t xml:space="preserve">    target_texts.append(target_text)</w:t>
       </w:r>
       <w:r>
-        <w:rPr>
-          <w:lang w:val="uk-UA"/>
-        </w:rPr>
-        <w:br/>
-        <w:t xml:space="preserve">    for char in input_text:</w:t>
-      </w:r>
-      <w:r>
-        <w:rPr>
-          <w:lang w:val="uk-UA"/>
-        </w:rPr>
-        <w:br/>
-        <w:t xml:space="preserve">        if char not in input_characters:</w:t>
-      </w:r>
-      <w:r>
-        <w:rPr>
-          <w:lang w:val="uk-UA"/>
-        </w:rPr>
-        <w:br/>
+        <w:br/>
+        <w:t xml:space="preserve">    </w:t>
+      </w:r>
+      <w:r>
+        <w:rPr>
+          <w:i/>
+          <w:iCs/>
+        </w:rPr>
+        <w:t># Збираємо унікальні символи</w:t>
+      </w:r>
+      <w:r>
+        <w:rPr>
+          <w:i/>
+          <w:iCs/>
+        </w:rPr>
+        <w:br/>
+        <w:t xml:space="preserve">    for </w:t>
+      </w:r>
+      <w:r>
+        <w:t xml:space="preserve">char </w:t>
+      </w:r>
+      <w:r>
+        <w:rPr>
+          <w:i/>
+          <w:iCs/>
+        </w:rPr>
+        <w:t xml:space="preserve">in </w:t>
+      </w:r>
+      <w:r>
+        <w:t>input_text:</w:t>
+      </w:r>
+      <w:r>
+        <w:br/>
+        <w:t xml:space="preserve">        </w:t>
+      </w:r>
+      <w:r>
+        <w:rPr>
+          <w:i/>
+          <w:iCs/>
+        </w:rPr>
+        <w:t xml:space="preserve">if </w:t>
+      </w:r>
+      <w:r>
+        <w:t xml:space="preserve">char </w:t>
+      </w:r>
+      <w:r>
+        <w:rPr>
+          <w:i/>
+          <w:iCs/>
+        </w:rPr>
+        <w:t xml:space="preserve">not in </w:t>
+      </w:r>
+      <w:r>
+        <w:t>input_characters:</w:t>
+      </w:r>
+      <w:r>
+        <w:br/>
+      </w:r>
+      <w:r>
+        <w:lastRenderedPageBreak/>
         <w:t xml:space="preserve">            input_characters.add(char)</w:t>
       </w:r>
       <w:r>
-        <w:rPr>
-          <w:lang w:val="uk-UA"/>
-        </w:rPr>
-        <w:br/>
-        <w:t xml:space="preserve">    for char in target_text:</w:t>
-      </w:r>
-      <w:r>
-        <w:rPr>
-          <w:lang w:val="uk-UA"/>
-        </w:rPr>
-        <w:br/>
-        <w:t xml:space="preserve">        if char not in target_characters:</w:t>
-      </w:r>
-      <w:r>
-        <w:rPr>
-          <w:lang w:val="uk-UA"/>
-        </w:rPr>
+        <w:br/>
+        <w:t xml:space="preserve">    </w:t>
+      </w:r>
+      <w:r>
+        <w:rPr>
+          <w:i/>
+          <w:iCs/>
+        </w:rPr>
+        <w:t xml:space="preserve">for </w:t>
+      </w:r>
+      <w:r>
+        <w:t xml:space="preserve">char </w:t>
+      </w:r>
+      <w:r>
+        <w:rPr>
+          <w:i/>
+          <w:iCs/>
+        </w:rPr>
+        <w:t xml:space="preserve">in </w:t>
+      </w:r>
+      <w:r>
+        <w:t>target_text:</w:t>
+      </w:r>
+      <w:r>
+        <w:br/>
+        <w:t xml:space="preserve">        </w:t>
+      </w:r>
+      <w:r>
+        <w:rPr>
+          <w:i/>
+          <w:iCs/>
+        </w:rPr>
+        <w:t xml:space="preserve">if </w:t>
+      </w:r>
+      <w:r>
+        <w:t xml:space="preserve">char </w:t>
+      </w:r>
+      <w:r>
+        <w:rPr>
+          <w:i/>
+          <w:iCs/>
+        </w:rPr>
+        <w:t xml:space="preserve">not in </w:t>
+      </w:r>
+      <w:r>
+        <w:t>target_characters:</w:t>
+      </w:r>
+      <w:r>
         <w:br/>
         <w:t xml:space="preserve">            target_characters.add(char)</w:t>
       </w:r>
       <w:r>
-        <w:rPr>
-          <w:lang w:val="uk-UA"/>
-        </w:rPr>
-        <w:br/>
-      </w:r>
-      <w:r>
-        <w:rPr>
-          <w:lang w:val="uk-UA"/>
-        </w:rPr>
-        <w:br/>
-        <w:t>input_characters = sorted(list(input_characters))</w:t>
-      </w:r>
-      <w:r>
-        <w:rPr>
-          <w:lang w:val="uk-UA"/>
-        </w:rPr>
-        <w:br/>
-        <w:t>target_characters = sorted(list(target_characters))</w:t>
-      </w:r>
-      <w:r>
-        <w:rPr>
-          <w:lang w:val="uk-UA"/>
-        </w:rPr>
-        <w:br/>
-        <w:t>num_encoder_tokens = len(input_characters)</w:t>
-      </w:r>
-      <w:r>
-        <w:rPr>
-          <w:lang w:val="uk-UA"/>
-        </w:rPr>
-        <w:br/>
-      </w:r>
-      <w:r>
-        <w:rPr>
-          <w:lang w:val="uk-UA"/>
-        </w:rPr>
+        <w:br/>
+      </w:r>
+      <w:r>
+        <w:br/>
+      </w:r>
+      <w:r>
+        <w:rPr>
+          <w:i/>
+          <w:iCs/>
+        </w:rPr>
+        <w:t># Сортуємо та індексуємо словники символів</w:t>
+      </w:r>
+      <w:r>
+        <w:rPr>
+          <w:i/>
+          <w:iCs/>
+        </w:rPr>
+        <w:br/>
+      </w:r>
+      <w:r>
+        <w:t xml:space="preserve">input_characters = </w:t>
+      </w:r>
+      <w:r>
+        <w:rPr>
+          <w:i/>
+          <w:iCs/>
+        </w:rPr>
+        <w:t>sorted</w:t>
+      </w:r>
+      <w:r>
+        <w:t>(</w:t>
+      </w:r>
+      <w:r>
+        <w:rPr>
+          <w:i/>
+          <w:iCs/>
+        </w:rPr>
+        <w:t>list</w:t>
+      </w:r>
+      <w:r>
+        <w:t>(input_characters))</w:t>
+      </w:r>
+      <w:r>
+        <w:br/>
+        <w:t xml:space="preserve">target_characters = </w:t>
+      </w:r>
+      <w:r>
+        <w:rPr>
+          <w:i/>
+          <w:iCs/>
+        </w:rPr>
+        <w:t>sorted</w:t>
+      </w:r>
+      <w:r>
+        <w:t>(</w:t>
+      </w:r>
+      <w:r>
+        <w:rPr>
+          <w:i/>
+          <w:iCs/>
+        </w:rPr>
+        <w:t>list</w:t>
+      </w:r>
+      <w:r>
+        <w:t>(target_characters))</w:t>
+      </w:r>
+      <w:r>
+        <w:br/>
+        <w:t xml:space="preserve">num_encoder_tokens = </w:t>
+      </w:r>
+      <w:r>
+        <w:rPr>
+          <w:i/>
+          <w:iCs/>
+        </w:rPr>
+        <w:t>len</w:t>
+      </w:r>
+      <w:r>
+        <w:t>(input_characters)</w:t>
+      </w:r>
+      <w:r>
+        <w:br/>
+        <w:t xml:space="preserve">num_decoder_tokens = </w:t>
+      </w:r>
+      <w:r>
+        <w:rPr>
+          <w:i/>
+          <w:iCs/>
+        </w:rPr>
+        <w:t>len</w:t>
+      </w:r>
+      <w:r>
+        <w:t>(target_characters)</w:t>
+      </w:r>
+      <w:r>
+        <w:br/>
+        <w:t xml:space="preserve">max_encoder_seq_length = </w:t>
+      </w:r>
+      <w:r>
+        <w:rPr>
+          <w:i/>
+          <w:iCs/>
+        </w:rPr>
+        <w:t>max</w:t>
+      </w:r>
+      <w:r>
+        <w:t>([</w:t>
+      </w:r>
+      <w:r>
+        <w:rPr>
+          <w:i/>
+          <w:iCs/>
+        </w:rPr>
+        <w:t>len</w:t>
+      </w:r>
+      <w:r>
+        <w:t xml:space="preserve">(txt) </w:t>
+      </w:r>
+      <w:r>
+        <w:rPr>
+          <w:i/>
+          <w:iCs/>
+        </w:rPr>
+        <w:t xml:space="preserve">for </w:t>
+      </w:r>
+      <w:r>
+        <w:t xml:space="preserve">txt </w:t>
+      </w:r>
+      <w:r>
+        <w:rPr>
+          <w:i/>
+          <w:iCs/>
+        </w:rPr>
+        <w:t xml:space="preserve">in </w:t>
+      </w:r>
+      <w:r>
+        <w:t>input_texts])</w:t>
+      </w:r>
+      <w:r>
+        <w:br/>
+        <w:t xml:space="preserve">max_decoder_seq_length = </w:t>
+      </w:r>
+      <w:r>
+        <w:rPr>
+          <w:i/>
+          <w:iCs/>
+        </w:rPr>
+        <w:t>max</w:t>
+      </w:r>
+      <w:r>
+        <w:t>([</w:t>
+      </w:r>
+      <w:r>
+        <w:rPr>
+          <w:i/>
+          <w:iCs/>
+        </w:rPr>
+        <w:t>len</w:t>
+      </w:r>
+      <w:r>
+        <w:t xml:space="preserve">(txt) </w:t>
+      </w:r>
+      <w:r>
+        <w:rPr>
+          <w:i/>
+          <w:iCs/>
+        </w:rPr>
+        <w:t xml:space="preserve">for </w:t>
+      </w:r>
+      <w:r>
+        <w:t xml:space="preserve">txt </w:t>
+      </w:r>
+      <w:r>
+        <w:rPr>
+          <w:i/>
+          <w:iCs/>
+        </w:rPr>
+        <w:t xml:space="preserve">in </w:t>
+      </w:r>
+      <w:r>
+        <w:t>target_texts])</w:t>
+      </w:r>
+      <w:r>
+        <w:br/>
+      </w:r>
+      <w:r>
+        <w:br/>
+        <w:t xml:space="preserve">input_token_index = </w:t>
+      </w:r>
+      <w:r>
+        <w:rPr>
+          <w:i/>
+          <w:iCs/>
+        </w:rPr>
+        <w:t>dict</w:t>
+      </w:r>
+      <w:r>
+        <w:t xml:space="preserve">([(char, i) </w:t>
+      </w:r>
+      <w:r>
+        <w:rPr>
+          <w:i/>
+          <w:iCs/>
+        </w:rPr>
+        <w:t xml:space="preserve">for </w:t>
+      </w:r>
+      <w:r>
+        <w:t xml:space="preserve">i, char </w:t>
+      </w:r>
+      <w:r>
+        <w:rPr>
+          <w:i/>
+          <w:iCs/>
+        </w:rPr>
+        <w:t>in enumerate</w:t>
+      </w:r>
+      <w:r>
+        <w:t>(input_characters)])</w:t>
+      </w:r>
+      <w:r>
+        <w:br/>
+        <w:t xml:space="preserve">target_token_index = </w:t>
+      </w:r>
+      <w:r>
+        <w:rPr>
+          <w:i/>
+          <w:iCs/>
+        </w:rPr>
+        <w:t>dict</w:t>
+      </w:r>
+      <w:r>
+        <w:t xml:space="preserve">([(char, i) </w:t>
+      </w:r>
+      <w:r>
+        <w:rPr>
+          <w:i/>
+          <w:iCs/>
+        </w:rPr>
+        <w:t xml:space="preserve">for </w:t>
+      </w:r>
+      <w:r>
+        <w:t xml:space="preserve">i, char </w:t>
+      </w:r>
+      <w:r>
+        <w:rPr>
+          <w:i/>
+          <w:iCs/>
+        </w:rPr>
+        <w:t>in enumerate</w:t>
+      </w:r>
+      <w:r>
+        <w:t>(target_characters)])</w:t>
+      </w:r>
+      <w:r>
+        <w:br/>
+      </w:r>
+      <w:r>
+        <w:br/>
+      </w:r>
+      <w:r>
+        <w:rPr>
+          <w:i/>
+          <w:iCs/>
+        </w:rPr>
+        <w:t># Створюємо нульові матриці для one-hot кодування</w:t>
+      </w:r>
+      <w:r>
+        <w:rPr>
+          <w:i/>
+          <w:iCs/>
+        </w:rPr>
+        <w:br/>
+      </w:r>
+      <w:r>
+        <w:t>encoder_input_data = numpy.zeros(</w:t>
+      </w:r>
+      <w:r>
+        <w:br/>
+        <w:t xml:space="preserve">    (</w:t>
+      </w:r>
+      <w:r>
+        <w:rPr>
+          <w:i/>
+          <w:iCs/>
+        </w:rPr>
+        <w:t>len</w:t>
+      </w:r>
+      <w:r>
+        <w:t>(input_texts), max_encoder_seq_length, num_encoder_tokens), dtype="float32"</w:t>
+      </w:r>
+      <w:r>
+        <w:br/>
+        <w:t>)</w:t>
+      </w:r>
+      <w:r>
+        <w:br/>
+        <w:t>decoder_input_data = numpy.zeros(</w:t>
+      </w:r>
+      <w:r>
+        <w:br/>
+        <w:t xml:space="preserve">    (</w:t>
+      </w:r>
+      <w:r>
+        <w:rPr>
+          <w:i/>
+          <w:iCs/>
+        </w:rPr>
+        <w:t>len</w:t>
+      </w:r>
+      <w:r>
+        <w:t>(input_texts), max_decoder_seq_length, num_decoder_tokens), dtype="float32"</w:t>
+      </w:r>
+      <w:r>
+        <w:br/>
+        <w:t>)</w:t>
+      </w:r>
+      <w:r>
+        <w:br/>
+        <w:t>decoder_target_data = numpy.zeros(</w:t>
+      </w:r>
+      <w:r>
+        <w:br/>
+        <w:t xml:space="preserve">    (</w:t>
+      </w:r>
+      <w:r>
+        <w:rPr>
+          <w:i/>
+          <w:iCs/>
+        </w:rPr>
+        <w:t>len</w:t>
+      </w:r>
+      <w:r>
+        <w:t>(input_texts), max_decoder_seq_length, num_decoder_tokens), dtype="float32"</w:t>
+      </w:r>
+      <w:r>
+        <w:br/>
+        <w:t>)</w:t>
+      </w:r>
+      <w:r>
+        <w:br/>
+      </w:r>
+      <w:r>
+        <w:br/>
+      </w:r>
+      <w:r>
+        <w:rPr>
+          <w:i/>
+          <w:iCs/>
+        </w:rPr>
+        <w:t># Заповнюємо матриці one-hot даними</w:t>
+      </w:r>
+      <w:r>
+        <w:rPr>
+          <w:i/>
+          <w:iCs/>
+        </w:rPr>
+        <w:br/>
+        <w:t xml:space="preserve">for </w:t>
+      </w:r>
+      <w:r>
+        <w:t xml:space="preserve">i, (input_text, target_text) </w:t>
+      </w:r>
+      <w:r>
+        <w:rPr>
+          <w:i/>
+          <w:iCs/>
+        </w:rPr>
+        <w:t>in enumerate</w:t>
+      </w:r>
+      <w:r>
+        <w:t>(</w:t>
+      </w:r>
+      <w:r>
+        <w:rPr>
+          <w:i/>
+          <w:iCs/>
+        </w:rPr>
+        <w:t>zip</w:t>
+      </w:r>
+      <w:r>
+        <w:t>(input_texts, target_texts)):</w:t>
+      </w:r>
+      <w:r>
+        <w:br/>
+        <w:t xml:space="preserve">    </w:t>
+      </w:r>
+      <w:r>
+        <w:rPr>
+          <w:i/>
+          <w:iCs/>
+        </w:rPr>
+        <w:t xml:space="preserve">for </w:t>
+      </w:r>
+      <w:r>
+        <w:t xml:space="preserve">t, char </w:t>
+      </w:r>
+      <w:r>
+        <w:rPr>
+          <w:i/>
+          <w:iCs/>
+        </w:rPr>
+        <w:t>in enumerate</w:t>
+      </w:r>
+      <w:r>
+        <w:t>(input_text):</w:t>
+      </w:r>
+      <w:r>
+        <w:br/>
+        <w:t xml:space="preserve">        encoder_input_data[i, t, input_token_index[char]] = 1.0</w:t>
+      </w:r>
+      <w:r>
+        <w:br/>
+        <w:t xml:space="preserve">    </w:t>
+      </w:r>
+      <w:r>
+        <w:rPr>
+          <w:i/>
+          <w:iCs/>
+        </w:rPr>
+        <w:t># Додаємо padding (символ " ") до кінця</w:t>
+      </w:r>
+      <w:r>
+        <w:rPr>
+          <w:i/>
+          <w:iCs/>
+        </w:rPr>
+        <w:br/>
+        <w:t xml:space="preserve">    </w:t>
+      </w:r>
+      <w:r>
+        <w:t>encoder_input_data[i, t + 1 :, input_token_index[" "]] = 1.0</w:t>
+      </w:r>
+      <w:r>
+        <w:br/>
+        <w:t xml:space="preserve">    </w:t>
+      </w:r>
+      <w:r>
+        <w:rPr>
+          <w:i/>
+          <w:iCs/>
+        </w:rPr>
+        <w:t xml:space="preserve">for </w:t>
+      </w:r>
+      <w:r>
+        <w:t xml:space="preserve">t, char </w:t>
+      </w:r>
+      <w:r>
+        <w:rPr>
+          <w:i/>
+          <w:iCs/>
+        </w:rPr>
+        <w:t>in enumerate</w:t>
+      </w:r>
+      <w:r>
+        <w:t>(target_text):</w:t>
+      </w:r>
+      <w:r>
+        <w:br/>
+        <w:t xml:space="preserve">        decoder_input_data[i, t, target_token_index[char]] = 1.0</w:t>
+      </w:r>
+      <w:r>
+        <w:br/>
+        <w:t xml:space="preserve">        </w:t>
+      </w:r>
+      <w:r>
+        <w:rPr>
+          <w:i/>
+          <w:iCs/>
+        </w:rPr>
+        <w:t xml:space="preserve">if </w:t>
+      </w:r>
+      <w:r>
+        <w:t>t &gt; 0:</w:t>
+      </w:r>
+      <w:r>
+        <w:br/>
+        <w:t xml:space="preserve">            </w:t>
+      </w:r>
+      <w:r>
+        <w:rPr>
+          <w:i/>
+          <w:iCs/>
+        </w:rPr>
+        <w:t># decoder_target_data зсунутий на один крок у часі</w:t>
+      </w:r>
+      <w:r>
+        <w:rPr>
+          <w:i/>
+          <w:iCs/>
+        </w:rPr>
+        <w:br/>
+        <w:t xml:space="preserve">            </w:t>
+      </w:r>
+      <w:r>
+        <w:t>decoder_target_data[i, t - 1, target_token_index[char]] = 1.0</w:t>
+      </w:r>
+      <w:r>
+        <w:br/>
+        <w:t xml:space="preserve">    </w:t>
+      </w:r>
+      <w:r>
+        <w:rPr>
+          <w:i/>
+          <w:iCs/>
+        </w:rPr>
+        <w:t># Додаємо padding</w:t>
+      </w:r>
+      <w:r>
+        <w:rPr>
+          <w:i/>
+          <w:iCs/>
+        </w:rPr>
+        <w:br/>
+        <w:t xml:space="preserve">    </w:t>
+      </w:r>
+      <w:r>
+        <w:t>decoder_input_data[i, t + 1 :, target_token_index[" "]] = 1.0</w:t>
+      </w:r>
+      <w:r>
+        <w:br/>
+        <w:t xml:space="preserve">    decoder_target_data[i, t:, target_token_index[" "]] = 1.0</w:t>
+      </w:r>
+      <w:r>
+        <w:br/>
+      </w:r>
+      <w:r>
+        <w:br/>
+      </w:r>
+      <w:r>
+        <w:rPr>
+          <w:i/>
+          <w:iCs/>
+        </w:rPr>
+        <w:t># --- Побудова моделі з GRU ---</w:t>
+      </w:r>
+      <w:r>
+        <w:rPr>
+          <w:i/>
+          <w:iCs/>
+        </w:rPr>
+        <w:br/>
+      </w:r>
+      <w:r>
+        <w:t>encoder_inputs = tensorflow.keras.Input(shape=(</w:t>
+      </w:r>
+      <w:r>
+        <w:rPr>
+          <w:i/>
+          <w:iCs/>
+        </w:rPr>
+        <w:t>None</w:t>
+      </w:r>
+      <w:r>
+        <w:t>, num_encoder_tokens))</w:t>
+      </w:r>
+      <w:r>
+        <w:br/>
+      </w:r>
+      <w:r>
+        <w:rPr>
+          <w:i/>
+          <w:iCs/>
+        </w:rPr>
+        <w:t># Кодер GRU, повертає лише останній стан (state_h)</w:t>
+      </w:r>
+      <w:r>
+        <w:rPr>
+          <w:i/>
+          <w:iCs/>
+        </w:rPr>
+        <w:br/>
+      </w:r>
+      <w:r>
+        <w:t>encoder = tensorflow.keras.layers.GRU(latent_dim, return_state=</w:t>
+      </w:r>
+      <w:r>
+        <w:rPr>
+          <w:i/>
+          <w:iCs/>
+        </w:rPr>
+        <w:t>True</w:t>
+      </w:r>
+      <w:r>
+        <w:t>)</w:t>
+      </w:r>
+      <w:r>
+        <w:br/>
+        <w:t>encoder_gru_outputs, encoder_state_h = encoder(encoder_inputs)</w:t>
+      </w:r>
+      <w:r>
+        <w:br/>
+      </w:r>
+      <w:r>
+        <w:br/>
+        <w:t>decoder_inputs = tensorflow.keras.Input(shape=(</w:t>
+      </w:r>
+      <w:r>
+        <w:rPr>
+          <w:i/>
+          <w:iCs/>
+        </w:rPr>
+        <w:t>None</w:t>
+      </w:r>
+      <w:r>
+        <w:t xml:space="preserve">, </w:t>
+      </w:r>
+      <w:r>
         <w:lastRenderedPageBreak/>
-        <w:t>num_decoder_tokens = len(target_characters)</w:t>
-      </w:r>
-      <w:r>
-        <w:rPr>
-          <w:lang w:val="uk-UA"/>
-        </w:rPr>
-        <w:br/>
-        <w:t>max_encoder_seq_length = max([len(txt) for txt in input_texts])</w:t>
-      </w:r>
-      <w:r>
-        <w:rPr>
-          <w:lang w:val="uk-UA"/>
-        </w:rPr>
-        <w:br/>
-        <w:t>max_decoder_seq_length = max([len(txt) for txt in target_texts])</w:t>
-      </w:r>
-      <w:r>
-        <w:rPr>
-          <w:lang w:val="uk-UA"/>
-        </w:rPr>
-        <w:br/>
-      </w:r>
-      <w:r>
-        <w:rPr>
-          <w:lang w:val="uk-UA"/>
-        </w:rPr>
-        <w:br/>
-        <w:t>input_token_index = dict([(char, i) for i, char in enumerate(input_characters)])</w:t>
-      </w:r>
-      <w:r>
-        <w:rPr>
-          <w:lang w:val="uk-UA"/>
-        </w:rPr>
-        <w:br/>
-        <w:t>target_token_index = dict([(char, i) for i, char in enumerate(target_characters)])</w:t>
-      </w:r>
-      <w:r>
-        <w:rPr>
-          <w:lang w:val="uk-UA"/>
-        </w:rPr>
-        <w:br/>
-      </w:r>
-      <w:r>
-        <w:rPr>
-          <w:lang w:val="uk-UA"/>
-        </w:rPr>
-        <w:br/>
-        <w:t>encoder_input_data = numpy.zeros(</w:t>
-      </w:r>
-      <w:r>
-        <w:rPr>
-          <w:lang w:val="uk-UA"/>
-        </w:rPr>
-        <w:br/>
-        <w:t xml:space="preserve">    (len(input_texts), max_encoder_seq_length, num_encoder_tokens), dtype="float32"</w:t>
-      </w:r>
-      <w:r>
-        <w:rPr>
-          <w:lang w:val="uk-UA"/>
-        </w:rPr>
-        <w:br/>
+        <w:t>num_decoder_tokens))</w:t>
+      </w:r>
+      <w:r>
+        <w:br/>
+      </w:r>
+      <w:r>
+        <w:rPr>
+          <w:i/>
+          <w:iCs/>
+        </w:rPr>
+        <w:t># Декодер GRU, повертає повну послідовність виходів</w:t>
+      </w:r>
+      <w:r>
+        <w:rPr>
+          <w:i/>
+          <w:iCs/>
+        </w:rPr>
+        <w:br/>
+      </w:r>
+      <w:r>
+        <w:t>decoder_gru = tensorflow.keras.layers.GRU(latent_dim, return_sequences=</w:t>
+      </w:r>
+      <w:r>
+        <w:rPr>
+          <w:i/>
+          <w:iCs/>
+        </w:rPr>
+        <w:t>True</w:t>
+      </w:r>
+      <w:r>
+        <w:t>, return_state=</w:t>
+      </w:r>
+      <w:r>
+        <w:rPr>
+          <w:i/>
+          <w:iCs/>
+        </w:rPr>
+        <w:t>True</w:t>
+      </w:r>
+      <w:r>
         <w:t>)</w:t>
       </w:r>
       <w:r>
-        <w:rPr>
-          <w:lang w:val="uk-UA"/>
-        </w:rPr>
-        <w:br/>
-        <w:t>decoder_input_data = numpy.zeros(</w:t>
-      </w:r>
-      <w:r>
-        <w:rPr>
-          <w:lang w:val="uk-UA"/>
-        </w:rPr>
-        <w:br/>
-        <w:t xml:space="preserve">    (len(input_texts), max_decoder_seq_length, num_decoder_tokens), dtype="float32"</w:t>
-      </w:r>
-      <w:r>
-        <w:rPr>
-          <w:lang w:val="uk-UA"/>
-        </w:rPr>
+        <w:br/>
+      </w:r>
+      <w:r>
+        <w:rPr>
+          <w:i/>
+          <w:iCs/>
+        </w:rPr>
+        <w:t># Використовуємо стан кодера як початковий стан декодера</w:t>
+      </w:r>
+      <w:r>
+        <w:rPr>
+          <w:i/>
+          <w:iCs/>
+        </w:rPr>
+        <w:br/>
+      </w:r>
+      <w:r>
+        <w:t>decoder_gru_outputs, _ = decoder_gru(decoder_inputs, initial_state=encoder_state_h)</w:t>
+      </w:r>
+      <w:r>
+        <w:br/>
+      </w:r>
+      <w:r>
+        <w:br/>
+      </w:r>
+      <w:r>
+        <w:rPr>
+          <w:i/>
+          <w:iCs/>
+        </w:rPr>
+        <w:t># Dense шар для перетворення виходів GRU у ймовірності для кожного токена</w:t>
+      </w:r>
+      <w:r>
+        <w:rPr>
+          <w:i/>
+          <w:iCs/>
+        </w:rPr>
+        <w:br/>
+      </w:r>
+      <w:r>
+        <w:t>decoder_dense = tensorflow.keras.layers.Dense(num_decoder_tokens, activation="softmax")</w:t>
+      </w:r>
+      <w:r>
+        <w:br/>
+        <w:t>decoder_outputs = decoder_dense(decoder_gru_outputs)</w:t>
+      </w:r>
+      <w:r>
+        <w:br/>
+      </w:r>
+      <w:r>
+        <w:br/>
+      </w:r>
+      <w:r>
+        <w:rPr>
+          <w:i/>
+          <w:iCs/>
+        </w:rPr>
+        <w:t># Збираємо повну модель "транслятора"</w:t>
+      </w:r>
+      <w:r>
+        <w:rPr>
+          <w:i/>
+          <w:iCs/>
+        </w:rPr>
+        <w:br/>
+      </w:r>
+      <w:r>
+        <w:t>model = tensorflow.keras.Model([encoder_inputs, decoder_inputs], decoder_outputs)</w:t>
+      </w:r>
+      <w:r>
+        <w:br/>
+      </w:r>
+      <w:r>
+        <w:br/>
+        <w:t>model.compile(</w:t>
+      </w:r>
+      <w:r>
+        <w:br/>
+        <w:t xml:space="preserve">    optimizer="rmsprop", loss="categorical_crossentropy", metrics=["accuracy"]</w:t>
+      </w:r>
+      <w:r>
         <w:br/>
         <w:t>)</w:t>
       </w:r>
       <w:r>
-        <w:rPr>
-          <w:lang w:val="uk-UA"/>
-        </w:rPr>
-        <w:br/>
-        <w:t>decoder_target_data = numpy.zeros(</w:t>
-      </w:r>
-      <w:r>
-        <w:rPr>
-          <w:lang w:val="uk-UA"/>
-        </w:rPr>
-        <w:br/>
-        <w:t xml:space="preserve">    (len(input_texts), max_decoder_seq_length, num_decoder_tokens), dtype="float32"</w:t>
-      </w:r>
-      <w:r>
-        <w:rPr>
-          <w:lang w:val="uk-UA"/>
-        </w:rPr>
+        <w:br/>
+      </w:r>
+      <w:r>
+        <w:br/>
+      </w:r>
+      <w:r>
+        <w:rPr>
+          <w:i/>
+          <w:iCs/>
+        </w:rPr>
+        <w:t># Навчання моделі</w:t>
+      </w:r>
+      <w:r>
+        <w:rPr>
+          <w:i/>
+          <w:iCs/>
+        </w:rPr>
+        <w:br/>
+      </w:r>
+      <w:r>
+        <w:t>model.fit(</w:t>
+      </w:r>
+      <w:r>
+        <w:br/>
+        <w:t xml:space="preserve">    [encoder_input_data, decoder_input_data],</w:t>
+      </w:r>
+      <w:r>
+        <w:br/>
+        <w:t xml:space="preserve">    decoder_target_data,</w:t>
+      </w:r>
+      <w:r>
+        <w:br/>
+        <w:t xml:space="preserve">    batch_size=batch_size,</w:t>
+      </w:r>
+      <w:r>
+        <w:br/>
+        <w:t xml:space="preserve">    epochs=n,</w:t>
+      </w:r>
+      <w:r>
+        <w:br/>
+        <w:t xml:space="preserve">    validation_split=0.2,</w:t>
+      </w:r>
+      <w:r>
         <w:br/>
         <w:t>)</w:t>
       </w:r>
       <w:r>
-        <w:rPr>
-          <w:lang w:val="uk-UA"/>
-        </w:rPr>
-        <w:br/>
-      </w:r>
-      <w:r>
-        <w:rPr>
-          <w:lang w:val="uk-UA"/>
-        </w:rPr>
-        <w:br/>
-        <w:t>for i, (input_text, target_text) in enumerate(zip(input_texts, target_texts)):</w:t>
-      </w:r>
-      <w:r>
-        <w:rPr>
-          <w:lang w:val="uk-UA"/>
-        </w:rPr>
-        <w:br/>
-        <w:t xml:space="preserve">    for t, char in enumerate(input_text):</w:t>
-      </w:r>
-      <w:r>
-        <w:rPr>
-          <w:lang w:val="uk-UA"/>
-        </w:rPr>
-        <w:br/>
-        <w:t xml:space="preserve">        encoder_input_data[i, t, input_token_index[char]] = 1.0</w:t>
-      </w:r>
-      <w:r>
-        <w:rPr>
-          <w:lang w:val="uk-UA"/>
-        </w:rPr>
-        <w:br/>
-        <w:t xml:space="preserve">    encoder_input_data[i, t + 1:, input_token_index[" "]] = 1.0</w:t>
-      </w:r>
-      <w:r>
-        <w:rPr>
-          <w:lang w:val="uk-UA"/>
-        </w:rPr>
-        <w:br/>
-        <w:t xml:space="preserve">    for t, char in enumerate(target_text):</w:t>
-      </w:r>
-      <w:r>
-        <w:rPr>
-          <w:lang w:val="uk-UA"/>
-        </w:rPr>
-        <w:br/>
-        <w:t xml:space="preserve">        decoder_input_data[i, t, target_token_index[char]] = 1.0</w:t>
-      </w:r>
-      <w:r>
-        <w:rPr>
-          <w:lang w:val="uk-UA"/>
-        </w:rPr>
-        <w:br/>
-        <w:t xml:space="preserve">        if t &gt; 0:</w:t>
-      </w:r>
-      <w:r>
-        <w:rPr>
-          <w:lang w:val="uk-UA"/>
-        </w:rPr>
-        <w:br/>
-        <w:t xml:space="preserve">            decoder_target_data[i, t - 1, target_token_index[char]] = 1.0</w:t>
-      </w:r>
-      <w:r>
-        <w:rPr>
-          <w:lang w:val="uk-UA"/>
-        </w:rPr>
-        <w:br/>
-        <w:t xml:space="preserve">    decoder_input_data[i, t + 1:, target_token_index[" "]] = 1.0</w:t>
-      </w:r>
-      <w:r>
-        <w:rPr>
-          <w:lang w:val="uk-UA"/>
-        </w:rPr>
-        <w:br/>
-        <w:t xml:space="preserve">    decoder_target_data[i, t:, target_token_index[" "]] = 1.0</w:t>
-      </w:r>
-      <w:r>
-        <w:rPr>
-          <w:lang w:val="uk-UA"/>
-        </w:rPr>
-        <w:br/>
-      </w:r>
-      <w:r>
-        <w:rPr>
-          <w:lang w:val="uk-UA"/>
-        </w:rPr>
-        <w:br/>
-        <w:t># --- Побудова моделі з LSTM ---</w:t>
-      </w:r>
-      <w:r>
-        <w:rPr>
-          <w:lang w:val="uk-UA"/>
-        </w:rPr>
-        <w:br/>
-        <w:t>encoder_inputs = tensorflow.keras.Input(shape=(None, num_encoder_tokens))</w:t>
-      </w:r>
-      <w:r>
-        <w:rPr>
-          <w:lang w:val="uk-UA"/>
-        </w:rPr>
-        <w:br/>
-        <w:t>encoder = tensorflow.keras.layers.LSTM(latent_dim, return_state=True)</w:t>
-      </w:r>
-      <w:r>
-        <w:rPr>
-          <w:lang w:val="uk-UA"/>
-        </w:rPr>
-        <w:br/>
-        <w:t>encoder_lstm_outputs, encoder_state_h, encoder_state_c = encoder(encoder_inputs)</w:t>
-      </w:r>
-      <w:r>
-        <w:rPr>
-          <w:lang w:val="uk-UA"/>
-        </w:rPr>
-        <w:br/>
-        <w:t># Ми зберігаємо обидва стани: h (прихований стан) та c (стан комірки)</w:t>
-      </w:r>
-      <w:r>
-        <w:rPr>
-          <w:lang w:val="uk-UA"/>
-        </w:rPr>
-        <w:br/>
-        <w:t>encoder_states = [encoder_state_h, encoder_state_c]</w:t>
-      </w:r>
-      <w:r>
-        <w:rPr>
-          <w:lang w:val="uk-UA"/>
-        </w:rPr>
-        <w:br/>
-      </w:r>
-      <w:r>
-        <w:rPr>
-          <w:lang w:val="uk-UA"/>
-        </w:rPr>
-        <w:br/>
-        <w:t>decoder_inputs = tensorflow.keras.Input(shape=(None, num_decoder_tokens))</w:t>
-      </w:r>
-      <w:r>
-        <w:rPr>
-          <w:lang w:val="uk-UA"/>
-        </w:rPr>
-        <w:br/>
-        <w:t>decoder_lstm = tensorflow.keras.layers.LSTM(latent_dim, return_sequences=True, return_state=True)</w:t>
-      </w:r>
-      <w:r>
-        <w:rPr>
-          <w:lang w:val="uk-UA"/>
-        </w:rPr>
-        <w:br/>
-        <w:t># Подаємо стани кодера як початкові стани декодера</w:t>
-      </w:r>
-      <w:r>
-        <w:rPr>
-          <w:lang w:val="uk-UA"/>
-        </w:rPr>
-        <w:br/>
-        <w:t>decoder_lstm_outputs, _, _ = decoder_lstm(decoder_inputs, initial_state=encoder_states)</w:t>
-      </w:r>
-      <w:r>
-        <w:rPr>
-          <w:lang w:val="uk-UA"/>
-        </w:rPr>
-        <w:br/>
-      </w:r>
-      <w:r>
-        <w:rPr>
-          <w:lang w:val="uk-UA"/>
-        </w:rPr>
-        <w:br/>
-        <w:t>decoder_dense = tensorflow.keras.layers.Dense(num_decoder_tokens, activation="softmax")</w:t>
-      </w:r>
-      <w:r>
-        <w:rPr>
-          <w:lang w:val="uk-UA"/>
-        </w:rPr>
-        <w:br/>
-        <w:t>decoder_outputs = decoder_dense(decoder_lstm_outputs)</w:t>
-      </w:r>
-      <w:r>
-        <w:rPr>
-          <w:lang w:val="uk-UA"/>
-        </w:rPr>
-        <w:br/>
-      </w:r>
-      <w:r>
-        <w:rPr>
-          <w:lang w:val="uk-UA"/>
-        </w:rPr>
-        <w:br/>
-      </w:r>
-      <w:r>
-        <w:rPr>
-          <w:lang w:val="uk-UA"/>
-        </w:rPr>
+        <w:br/>
+      </w:r>
+      <w:r>
+        <w:br/>
+      </w:r>
+      <w:r>
+        <w:rPr>
+          <w:i/>
+          <w:iCs/>
+        </w:rPr>
+        <w:t># --- Побудова моделей для дешифрування (inference) ---</w:t>
+      </w:r>
+      <w:r>
+        <w:rPr>
+          <w:i/>
+          <w:iCs/>
+        </w:rPr>
+        <w:br/>
+      </w:r>
+      <w:r>
+        <w:rPr>
+          <w:i/>
+          <w:iCs/>
+        </w:rPr>
+        <w:br/>
+        <w:t># Модель шифратора (кодер): приймає вхід, повертає стан</w:t>
+      </w:r>
+      <w:r>
+        <w:rPr>
+          <w:i/>
+          <w:iCs/>
+        </w:rPr>
+        <w:br/>
+      </w:r>
+      <w:r>
+        <w:t>encoder_model = tensorflow.keras.Model(encoder_inputs, encoder_state_h)</w:t>
+      </w:r>
+      <w:r>
+        <w:br/>
+      </w:r>
+      <w:r>
+        <w:br/>
+      </w:r>
+      <w:r>
+        <w:rPr>
+          <w:i/>
+          <w:iCs/>
+        </w:rPr>
+        <w:t># Модель дешифратора (декодер)</w:t>
+      </w:r>
+      <w:r>
+        <w:rPr>
+          <w:i/>
+          <w:iCs/>
+        </w:rPr>
+        <w:br/>
+      </w:r>
+      <w:r>
+        <w:t>decoder_inputs_inf = tensorflow.keras.Input(shape=(</w:t>
+      </w:r>
+      <w:r>
+        <w:rPr>
+          <w:i/>
+          <w:iCs/>
+        </w:rPr>
+        <w:t>None</w:t>
+      </w:r>
+      <w:r>
+        <w:t>, num_decoder_tokens))</w:t>
+      </w:r>
+      <w:r>
+        <w:br/>
+        <w:t>decoder_input_state_h_inf = tensorflow.keras.Input(shape=(latent_dim,))</w:t>
+      </w:r>
+      <w:r>
+        <w:br/>
+      </w:r>
+      <w:r>
+        <w:br/>
+      </w:r>
+      <w:r>
+        <w:rPr>
+          <w:i/>
+          <w:iCs/>
+        </w:rPr>
+        <w:t># Використовуємо ті самі навчені шари</w:t>
+      </w:r>
+      <w:r>
+        <w:rPr>
+          <w:i/>
+          <w:iCs/>
+        </w:rPr>
+        <w:br/>
+      </w:r>
+      <w:r>
+        <w:t>decoder_gru_inf = model.layers[3]</w:t>
+      </w:r>
+      <w:r>
+        <w:br/>
+        <w:t>decoder_gru_outputs_inf, decoder_state_h_inf = decoder_gru_inf(</w:t>
+      </w:r>
+      <w:r>
+        <w:br/>
+        <w:t xml:space="preserve">    decoder_inputs_inf, initial_state=decoder_input_state_h_inf</w:t>
+      </w:r>
+      <w:r>
+        <w:br/>
+        <w:t>)</w:t>
+      </w:r>
+      <w:r>
+        <w:br/>
+      </w:r>
+      <w:r>
+        <w:br/>
+        <w:t>decoder_dense_inf = model.layers[4]</w:t>
+      </w:r>
+      <w:r>
+        <w:br/>
+        <w:t>decoder_outputs_inf = decoder_dense_inf(decoder_gru_outputs_inf)</w:t>
+      </w:r>
+      <w:r>
+        <w:br/>
+      </w:r>
+      <w:r>
+        <w:br/>
+      </w:r>
+      <w:r>
+        <w:rPr>
+          <w:i/>
+          <w:iCs/>
+        </w:rPr>
+        <w:t># Збираємо модель декодера</w:t>
+      </w:r>
+      <w:r>
+        <w:rPr>
+          <w:i/>
+          <w:iCs/>
+        </w:rPr>
+        <w:br/>
+      </w:r>
+      <w:r>
+        <w:t>decoder_model = tensorflow.keras.Model(</w:t>
+      </w:r>
+      <w:r>
+        <w:br/>
+        <w:t xml:space="preserve">    [decoder_inputs_inf] + [decoder_input_state_h_inf],</w:t>
+      </w:r>
+      <w:r>
+        <w:br/>
+        <w:t xml:space="preserve">    [decoder_outputs_inf] + [decoder_state_h_inf]</w:t>
+      </w:r>
+      <w:r>
+        <w:br/>
+        <w:t>)</w:t>
+      </w:r>
+      <w:r>
+        <w:br/>
+      </w:r>
+      <w:r>
         <w:lastRenderedPageBreak/>
-        <w:t>model = tensorflow.keras.Model([encoder_inputs, decoder_inputs], decoder_outputs)</w:t>
-      </w:r>
-      <w:r>
-        <w:rPr>
-          <w:lang w:val="uk-UA"/>
-        </w:rPr>
-        <w:br/>
-      </w:r>
-      <w:r>
-        <w:rPr>
-          <w:lang w:val="uk-UA"/>
-        </w:rPr>
-        <w:br/>
-        <w:t>model.compile(</w:t>
-      </w:r>
-      <w:r>
-        <w:rPr>
-          <w:lang w:val="uk-UA"/>
-        </w:rPr>
-        <w:br/>
-        <w:t xml:space="preserve">    optimizer="rmsprop", loss="categorical_crossentropy", metrics=["accuracy"]</w:t>
-      </w:r>
-      <w:r>
-        <w:rPr>
-          <w:lang w:val="uk-UA"/>
-        </w:rPr>
-        <w:br/>
-        <w:t>)</w:t>
-      </w:r>
-      <w:r>
-        <w:rPr>
-          <w:lang w:val="uk-UA"/>
-        </w:rPr>
-        <w:br/>
-      </w:r>
-      <w:r>
-        <w:rPr>
-          <w:lang w:val="uk-UA"/>
-        </w:rPr>
-        <w:br/>
-        <w:t>model.fit(</w:t>
-      </w:r>
-      <w:r>
-        <w:rPr>
-          <w:lang w:val="uk-UA"/>
-        </w:rPr>
-        <w:br/>
-        <w:t xml:space="preserve">    [encoder_input_data, decoder_input_data],</w:t>
-      </w:r>
-      <w:r>
-        <w:rPr>
-          <w:lang w:val="uk-UA"/>
-        </w:rPr>
-        <w:br/>
-        <w:t xml:space="preserve">    decoder_target_data,</w:t>
-      </w:r>
-      <w:r>
-        <w:rPr>
-          <w:lang w:val="uk-UA"/>
-        </w:rPr>
-        <w:br/>
-        <w:t xml:space="preserve">    batch_size=batch_size,</w:t>
-      </w:r>
-      <w:r>
-        <w:rPr>
-          <w:lang w:val="uk-UA"/>
-        </w:rPr>
-        <w:br/>
-        <w:t xml:space="preserve">    epochs=n,</w:t>
-      </w:r>
-      <w:r>
-        <w:rPr>
-          <w:lang w:val="uk-UA"/>
-        </w:rPr>
-        <w:br/>
-        <w:t xml:space="preserve">    validation_split=0.2,</w:t>
-      </w:r>
-      <w:r>
-        <w:rPr>
-          <w:lang w:val="uk-UA"/>
-        </w:rPr>
-        <w:br/>
-        <w:t>)</w:t>
-      </w:r>
-      <w:r>
-        <w:rPr>
-          <w:lang w:val="uk-UA"/>
-        </w:rPr>
-        <w:br/>
-      </w:r>
-      <w:r>
-        <w:rPr>
-          <w:lang w:val="uk-UA"/>
-        </w:rPr>
-        <w:br/>
-        <w:t># --- Побудова моделей для дешифрування ---</w:t>
-      </w:r>
-      <w:r>
-        <w:rPr>
-          <w:lang w:val="uk-UA"/>
-        </w:rPr>
-        <w:br/>
-        <w:t>encoder_model = tensorflow.keras.Model(encoder_inputs, encoder_states)</w:t>
-      </w:r>
-      <w:r>
-        <w:rPr>
-          <w:lang w:val="uk-UA"/>
-        </w:rPr>
-        <w:br/>
-      </w:r>
-      <w:r>
-        <w:rPr>
-          <w:lang w:val="uk-UA"/>
-        </w:rPr>
-        <w:br/>
-        <w:t>decoder_inputs = model.input[1]</w:t>
-      </w:r>
-      <w:r>
-        <w:rPr>
-          <w:lang w:val="uk-UA"/>
-        </w:rPr>
-        <w:br/>
-        <w:t>decoder_input_state_h = tensorflow.keras.Input(shape=(latent_dim,))</w:t>
-      </w:r>
-      <w:r>
-        <w:rPr>
-          <w:lang w:val="uk-UA"/>
-        </w:rPr>
-        <w:br/>
-        <w:t>decoder_input_state_c = tensorflow.keras.Input(shape=(latent_dim,))</w:t>
-      </w:r>
-      <w:r>
-        <w:rPr>
-          <w:lang w:val="uk-UA"/>
-        </w:rPr>
-        <w:br/>
-        <w:t>decoder_inputs_states = [decoder_input_state_h, decoder_input_state_c]</w:t>
-      </w:r>
-      <w:r>
-        <w:rPr>
-          <w:lang w:val="uk-UA"/>
-        </w:rPr>
-        <w:br/>
-      </w:r>
-      <w:r>
-        <w:rPr>
-          <w:lang w:val="uk-UA"/>
-        </w:rPr>
-        <w:br/>
-        <w:t>decoder_lstm = model.layers[3]</w:t>
-      </w:r>
-      <w:r>
-        <w:rPr>
-          <w:lang w:val="uk-UA"/>
-        </w:rPr>
-        <w:br/>
-        <w:t>decoder_lstm_outputs, decoder_state_h, decoder_state_c = decoder_lstm(</w:t>
-      </w:r>
-      <w:r>
-        <w:rPr>
-          <w:lang w:val="uk-UA"/>
-        </w:rPr>
-        <w:br/>
-        <w:t xml:space="preserve">    decoder_inputs, initial_state=decoder_inputs_states</w:t>
-      </w:r>
-      <w:r>
-        <w:rPr>
-          <w:lang w:val="uk-UA"/>
-        </w:rPr>
-        <w:br/>
-        <w:t>)</w:t>
-      </w:r>
-      <w:r>
-        <w:rPr>
-          <w:lang w:val="uk-UA"/>
-        </w:rPr>
-        <w:br/>
-        <w:t>decoder_states = [decoder_state_h, decoder_state_c]</w:t>
-      </w:r>
-      <w:r>
-        <w:rPr>
-          <w:lang w:val="uk-UA"/>
-        </w:rPr>
-        <w:br/>
-      </w:r>
-      <w:r>
-        <w:rPr>
-          <w:lang w:val="uk-UA"/>
-        </w:rPr>
-        <w:br/>
-        <w:t>decoder_dense = model.layers[4]</w:t>
-      </w:r>
-      <w:r>
-        <w:rPr>
-          <w:lang w:val="uk-UA"/>
-        </w:rPr>
-        <w:br/>
-        <w:t>decoder_outputs = decoder_dense(decoder_lstm_outputs)</w:t>
-      </w:r>
-      <w:r>
-        <w:rPr>
-          <w:lang w:val="uk-UA"/>
-        </w:rPr>
-        <w:br/>
-      </w:r>
-      <w:r>
-        <w:rPr>
-          <w:lang w:val="uk-UA"/>
-        </w:rPr>
-        <w:br/>
-        <w:t>decoder_model = tensorflow.keras.Model(</w:t>
-      </w:r>
-      <w:r>
-        <w:rPr>
-          <w:lang w:val="uk-UA"/>
-        </w:rPr>
-        <w:br/>
-        <w:t xml:space="preserve">    [decoder_inputs] + decoder_inputs_states, [decoder_outputs] + decoder_states</w:t>
-      </w:r>
-      <w:r>
-        <w:rPr>
-          <w:lang w:val="uk-UA"/>
-        </w:rPr>
-        <w:br/>
-        <w:t>)</w:t>
-      </w:r>
-      <w:r>
-        <w:rPr>
-          <w:lang w:val="uk-UA"/>
-        </w:rPr>
-        <w:br/>
-      </w:r>
-      <w:r>
-        <w:rPr>
-          <w:lang w:val="uk-UA"/>
-        </w:rPr>
-        <w:br/>
-        <w:t>reverse_input_char_index = dict((i, char) for char, i in input_token_index.items())</w:t>
-      </w:r>
-      <w:r>
-        <w:rPr>
-          <w:lang w:val="uk-UA"/>
-        </w:rPr>
-        <w:br/>
-        <w:t>reverse_target_char_index = dict((i, char) for char, i in target_token_index.items())</w:t>
-      </w:r>
-      <w:r>
-        <w:rPr>
-          <w:lang w:val="uk-UA"/>
-        </w:rPr>
-        <w:br/>
-      </w:r>
-      <w:r>
-        <w:rPr>
-          <w:lang w:val="uk-UA"/>
-        </w:rPr>
-        <w:br/>
-        <w:t>for seq_index in range(20):</w:t>
-      </w:r>
-      <w:r>
-        <w:rPr>
-          <w:lang w:val="uk-UA"/>
-        </w:rPr>
-        <w:br/>
-        <w:t xml:space="preserve">    input_seq = encoder_input_data[seq_index: seq_index + 1]</w:t>
-      </w:r>
-      <w:r>
-        <w:rPr>
-          <w:lang w:val="uk-UA"/>
-        </w:rPr>
-        <w:br/>
-      </w:r>
-      <w:r>
-        <w:rPr>
-          <w:lang w:val="uk-UA"/>
-        </w:rPr>
-        <w:br/>
-        <w:t xml:space="preserve">    # Кодер LSTM повертає два стани (h і c)</w:t>
-      </w:r>
-      <w:r>
-        <w:rPr>
-          <w:lang w:val="uk-UA"/>
-        </w:rPr>
-        <w:br/>
-        <w:t xml:space="preserve">    states_value = encoder_model.predict(input_seq, verbose=0)</w:t>
-      </w:r>
-      <w:r>
-        <w:rPr>
-          <w:lang w:val="uk-UA"/>
-        </w:rPr>
-        <w:br/>
-      </w:r>
-      <w:r>
-        <w:rPr>
-          <w:lang w:val="uk-UA"/>
-        </w:rPr>
-        <w:br/>
-        <w:t xml:space="preserve">    target_seq = numpy.zeros((1, 1, num_decoder_tokens))</w:t>
-      </w:r>
-      <w:r>
-        <w:rPr>
-          <w:lang w:val="uk-UA"/>
-        </w:rPr>
+        <w:br/>
+      </w:r>
+      <w:r>
+        <w:rPr>
+          <w:i/>
+          <w:iCs/>
+        </w:rPr>
+        <w:t># Словники для розкодування (індекс -&gt; символ)</w:t>
+      </w:r>
+      <w:r>
+        <w:rPr>
+          <w:i/>
+          <w:iCs/>
+        </w:rPr>
+        <w:br/>
+      </w:r>
+      <w:r>
+        <w:t xml:space="preserve">reverse_input_char_index = </w:t>
+      </w:r>
+      <w:r>
+        <w:rPr>
+          <w:i/>
+          <w:iCs/>
+        </w:rPr>
+        <w:t>dict</w:t>
+      </w:r>
+      <w:r>
+        <w:t xml:space="preserve">((i, char) </w:t>
+      </w:r>
+      <w:r>
+        <w:rPr>
+          <w:i/>
+          <w:iCs/>
+        </w:rPr>
+        <w:t xml:space="preserve">for </w:t>
+      </w:r>
+      <w:r>
+        <w:t xml:space="preserve">char, i </w:t>
+      </w:r>
+      <w:r>
+        <w:rPr>
+          <w:i/>
+          <w:iCs/>
+        </w:rPr>
+        <w:t xml:space="preserve">in </w:t>
+      </w:r>
+      <w:r>
+        <w:t>input_token_index.items())</w:t>
+      </w:r>
+      <w:r>
+        <w:br/>
+        <w:t xml:space="preserve">reverse_target_char_index = </w:t>
+      </w:r>
+      <w:r>
+        <w:rPr>
+          <w:i/>
+          <w:iCs/>
+        </w:rPr>
+        <w:t>dict</w:t>
+      </w:r>
+      <w:r>
+        <w:t xml:space="preserve">((i, char) </w:t>
+      </w:r>
+      <w:r>
+        <w:rPr>
+          <w:i/>
+          <w:iCs/>
+        </w:rPr>
+        <w:t xml:space="preserve">for </w:t>
+      </w:r>
+      <w:r>
+        <w:t xml:space="preserve">char, i </w:t>
+      </w:r>
+      <w:r>
+        <w:rPr>
+          <w:i/>
+          <w:iCs/>
+        </w:rPr>
+        <w:t xml:space="preserve">in </w:t>
+      </w:r>
+      <w:r>
+        <w:t>target_token_index.items())</w:t>
+      </w:r>
+      <w:r>
+        <w:br/>
+      </w:r>
+      <w:r>
+        <w:br/>
+      </w:r>
+      <w:r>
+        <w:rPr>
+          <w:i/>
+          <w:iCs/>
+        </w:rPr>
+        <w:t># --- Цикл дешифрації ---</w:t>
+      </w:r>
+      <w:r>
+        <w:rPr>
+          <w:i/>
+          <w:iCs/>
+        </w:rPr>
+        <w:br/>
+        <w:t xml:space="preserve">for </w:t>
+      </w:r>
+      <w:r>
+        <w:t xml:space="preserve">seq_index </w:t>
+      </w:r>
+      <w:r>
+        <w:rPr>
+          <w:i/>
+          <w:iCs/>
+        </w:rPr>
+        <w:t>in range</w:t>
+      </w:r>
+      <w:r>
+        <w:t>(20):</w:t>
+      </w:r>
+      <w:r>
+        <w:br/>
+        <w:t xml:space="preserve">    input_seq = encoder_input_data[seq_index : seq_index + 1]</w:t>
+      </w:r>
+      <w:r>
+        <w:br/>
+      </w:r>
+      <w:r>
+        <w:br/>
+        <w:t xml:space="preserve">    </w:t>
+      </w:r>
+      <w:r>
+        <w:rPr>
+          <w:i/>
+          <w:iCs/>
+        </w:rPr>
+        <w:t># Отримуємо початковий стан від кодера</w:t>
+      </w:r>
+      <w:r>
+        <w:rPr>
+          <w:i/>
+          <w:iCs/>
+        </w:rPr>
+        <w:br/>
+        <w:t xml:space="preserve">    </w:t>
+      </w:r>
+      <w:r>
+        <w:t>states_value = encoder_model.predict(input_seq, verbose=0)</w:t>
+      </w:r>
+      <w:r>
+        <w:br/>
+      </w:r>
+      <w:r>
+        <w:br/>
+        <w:t xml:space="preserve">    </w:t>
+      </w:r>
+      <w:r>
+        <w:rPr>
+          <w:i/>
+          <w:iCs/>
+        </w:rPr>
+        <w:t># Створюємо стартовий токен (символ '\t')</w:t>
+      </w:r>
+      <w:r>
+        <w:rPr>
+          <w:i/>
+          <w:iCs/>
+        </w:rPr>
+        <w:br/>
+        <w:t xml:space="preserve">    </w:t>
+      </w:r>
+      <w:r>
+        <w:t>target_seq = numpy.zeros((1, 1, num_decoder_tokens))</w:t>
+      </w:r>
+      <w:r>
         <w:br/>
         <w:t xml:space="preserve">    target_seq[0, 0, target_token_index["\t"]] = 1.0</w:t>
       </w:r>
       <w:r>
-        <w:rPr>
-          <w:lang w:val="uk-UA"/>
-        </w:rPr>
-        <w:br/>
-        <w:t xml:space="preserve">    stop_condition = False</w:t>
-      </w:r>
-      <w:r>
-        <w:rPr>
-          <w:lang w:val="uk-UA"/>
-        </w:rPr>
-        <w:br/>
-        <w:t xml:space="preserve">    decoded_sentence = ""</w:t>
-      </w:r>
-      <w:r>
-        <w:rPr>
-          <w:lang w:val="uk-UA"/>
-        </w:rPr>
-        <w:br/>
-      </w:r>
-      <w:r>
-        <w:rPr>
-          <w:lang w:val="uk-UA"/>
-        </w:rPr>
-        <w:lastRenderedPageBreak/>
-        <w:br/>
-        <w:t xml:space="preserve">    while not stop_condition:</w:t>
-      </w:r>
-      <w:r>
-        <w:rPr>
-          <w:lang w:val="uk-UA"/>
-        </w:rPr>
-        <w:br/>
-        <w:t xml:space="preserve">        # Декодер LSTM вимагає обидва стани (h і c)</w:t>
-      </w:r>
-      <w:r>
-        <w:rPr>
-          <w:lang w:val="uk-UA"/>
-        </w:rPr>
-        <w:br/>
-        <w:t xml:space="preserve">        output_tokens, h, c = decoder_model.predict(</w:t>
-      </w:r>
-      <w:r>
-        <w:rPr>
-          <w:lang w:val="uk-UA"/>
-        </w:rPr>
-        <w:br/>
-        <w:t xml:space="preserve">            [target_seq] + states_value, verbose=0</w:t>
-      </w:r>
-      <w:r>
-        <w:rPr>
-          <w:lang w:val="uk-UA"/>
-        </w:rPr>
-        <w:br/>
-        <w:t xml:space="preserve">        )</w:t>
-      </w:r>
-      <w:r>
-        <w:rPr>
-          <w:lang w:val="uk-UA"/>
-        </w:rPr>
-        <w:br/>
-      </w:r>
-      <w:r>
-        <w:rPr>
-          <w:lang w:val="uk-UA"/>
-        </w:rPr>
-        <w:br/>
-        <w:t xml:space="preserve">        sampled_token_index = numpy.argmax(output_tokens[0, -1, :])</w:t>
-      </w:r>
-      <w:r>
-        <w:rPr>
-          <w:lang w:val="uk-UA"/>
-        </w:rPr>
+        <w:br/>
+      </w:r>
+      <w:r>
+        <w:br/>
+        <w:t xml:space="preserve">    stop_condition = </w:t>
+      </w:r>
+      <w:r>
+        <w:rPr>
+          <w:i/>
+          <w:iCs/>
+        </w:rPr>
+        <w:t>False</w:t>
+      </w:r>
+      <w:r>
+        <w:rPr>
+          <w:i/>
+          <w:iCs/>
+        </w:rPr>
+        <w:br/>
+        <w:t xml:space="preserve">    </w:t>
+      </w:r>
+      <w:r>
+        <w:t>decoded_sentence = ""</w:t>
+      </w:r>
+      <w:r>
+        <w:br/>
+      </w:r>
+      <w:r>
+        <w:br/>
+        <w:t xml:space="preserve">    </w:t>
+      </w:r>
+      <w:r>
+        <w:rPr>
+          <w:i/>
+          <w:iCs/>
+        </w:rPr>
+        <w:t xml:space="preserve">while not </w:t>
+      </w:r>
+      <w:r>
+        <w:t>stop_condition:</w:t>
+      </w:r>
+      <w:r>
+        <w:br/>
+        <w:t xml:space="preserve">        </w:t>
+      </w:r>
+      <w:r>
+        <w:rPr>
+          <w:i/>
+          <w:iCs/>
+        </w:rPr>
+        <w:t># Подаємо токен і стан в декодер</w:t>
+      </w:r>
+      <w:r>
+        <w:rPr>
+          <w:i/>
+          <w:iCs/>
+        </w:rPr>
+        <w:br/>
+        <w:t xml:space="preserve">        </w:t>
+      </w:r>
+      <w:r>
+        <w:t>output_tokens, h = decoder_model.predict([target_seq] + [states_value], verbose=0)</w:t>
+      </w:r>
+      <w:r>
+        <w:br/>
+      </w:r>
+      <w:r>
+        <w:br/>
+        <w:t xml:space="preserve">        </w:t>
+      </w:r>
+      <w:r>
+        <w:rPr>
+          <w:i/>
+          <w:iCs/>
+        </w:rPr>
+        <w:t># Обираємо наступний токен з найбільшою ймовірністю</w:t>
+      </w:r>
+      <w:r>
+        <w:rPr>
+          <w:i/>
+          <w:iCs/>
+        </w:rPr>
+        <w:br/>
+        <w:t xml:space="preserve">        </w:t>
+      </w:r>
+      <w:r>
+        <w:t>sampled_token_index = numpy.argmax(output_tokens[0, -1, :])</w:t>
+      </w:r>
+      <w:r>
         <w:br/>
         <w:t xml:space="preserve">        sampled_char = reverse_target_char_index[sampled_token_index]</w:t>
       </w:r>
       <w:r>
-        <w:rPr>
-          <w:lang w:val="uk-UA"/>
-        </w:rPr>
         <w:br/>
         <w:t xml:space="preserve">        decoded_sentence += sampled_char</w:t>
       </w:r>
       <w:r>
-        <w:rPr>
-          <w:lang w:val="uk-UA"/>
-        </w:rPr>
-        <w:br/>
-      </w:r>
-      <w:r>
-        <w:rPr>
-          <w:lang w:val="uk-UA"/>
-        </w:rPr>
-        <w:br/>
-        <w:t xml:space="preserve">        if sampled_char == "\n" or len(decoded_sentence) &gt; max_decoder_seq_length:</w:t>
-      </w:r>
-      <w:r>
-        <w:rPr>
-          <w:lang w:val="uk-UA"/>
-        </w:rPr>
-        <w:br/>
-        <w:t xml:space="preserve">            stop_condition = True</w:t>
-      </w:r>
-      <w:r>
-        <w:rPr>
-          <w:lang w:val="uk-UA"/>
-        </w:rPr>
-        <w:br/>
-      </w:r>
-      <w:r>
-        <w:rPr>
-          <w:lang w:val="uk-UA"/>
-        </w:rPr>
-        <w:br/>
-        <w:t xml:space="preserve">        target_seq = numpy.zeros((1, 1, num_decoder_tokens))</w:t>
-      </w:r>
-      <w:r>
-        <w:rPr>
-          <w:lang w:val="uk-UA"/>
-        </w:rPr>
+        <w:br/>
+      </w:r>
+      <w:r>
+        <w:br/>
+        <w:t xml:space="preserve">        </w:t>
+      </w:r>
+      <w:r>
+        <w:rPr>
+          <w:i/>
+          <w:iCs/>
+        </w:rPr>
+        <w:t># Умова зупинки: знайдено '\n' або перевищено ліміт</w:t>
+      </w:r>
+      <w:r>
+        <w:rPr>
+          <w:i/>
+          <w:iCs/>
+        </w:rPr>
+        <w:br/>
+        <w:t xml:space="preserve">        if </w:t>
+      </w:r>
+      <w:r>
+        <w:t xml:space="preserve">sampled_char == "\n" </w:t>
+      </w:r>
+      <w:r>
+        <w:rPr>
+          <w:i/>
+          <w:iCs/>
+        </w:rPr>
+        <w:t>or len</w:t>
+      </w:r>
+      <w:r>
+        <w:t>(decoded_sentence) &gt; max_decoder_seq_length:</w:t>
+      </w:r>
+      <w:r>
+        <w:br/>
+        <w:t xml:space="preserve">            stop_condition = </w:t>
+      </w:r>
+      <w:r>
+        <w:rPr>
+          <w:i/>
+          <w:iCs/>
+        </w:rPr>
+        <w:t>True</w:t>
+      </w:r>
+      <w:r>
+        <w:rPr>
+          <w:i/>
+          <w:iCs/>
+        </w:rPr>
+        <w:br/>
+      </w:r>
+      <w:r>
+        <w:rPr>
+          <w:i/>
+          <w:iCs/>
+        </w:rPr>
+        <w:br/>
+        <w:t xml:space="preserve">        # Готуємо наступний вхід для декодера:</w:t>
+      </w:r>
+      <w:r>
+        <w:rPr>
+          <w:i/>
+          <w:iCs/>
+        </w:rPr>
+        <w:br/>
+        <w:t xml:space="preserve">        # 1. Створюємо one-hot для нового токена</w:t>
+      </w:r>
+      <w:r>
+        <w:rPr>
+          <w:i/>
+          <w:iCs/>
+        </w:rPr>
+        <w:br/>
+        <w:t xml:space="preserve">        </w:t>
+      </w:r>
+      <w:r>
+        <w:t>target_seq = numpy.zeros((1, 1, num_decoder_tokens))</w:t>
+      </w:r>
+      <w:r>
         <w:br/>
         <w:t xml:space="preserve">        target_seq[0, 0, sampled_token_index] = 1.0</w:t>
       </w:r>
       <w:r>
-        <w:rPr>
-          <w:lang w:val="uk-UA"/>
-        </w:rPr>
-        <w:br/>
-      </w:r>
-      <w:r>
-        <w:rPr>
-          <w:lang w:val="uk-UA"/>
-        </w:rPr>
-        <w:br/>
-        <w:t xml:space="preserve">        # Оновлюємо обидва стани для наступної ітерації</w:t>
-      </w:r>
-      <w:r>
-        <w:rPr>
-          <w:lang w:val="uk-UA"/>
-        </w:rPr>
-        <w:br/>
-        <w:t xml:space="preserve">        states_value = [h, c]</w:t>
-      </w:r>
-      <w:r>
-        <w:rPr>
-          <w:lang w:val="uk-UA"/>
-        </w:rPr>
-        <w:br/>
-      </w:r>
-      <w:r>
-        <w:rPr>
-          <w:lang w:val="uk-UA"/>
-        </w:rPr>
-        <w:br/>
-        <w:t xml:space="preserve">    print("-")</w:t>
-      </w:r>
-      <w:r>
-        <w:rPr>
-          <w:lang w:val="uk-UA"/>
-        </w:rPr>
-        <w:br/>
-        <w:t xml:space="preserve">    print("Input sentence:", input_texts[seq_index])</w:t>
-      </w:r>
-      <w:r>
-        <w:rPr>
-          <w:lang w:val="uk-UA"/>
-        </w:rPr>
-        <w:br/>
-        <w:t xml:space="preserve">    print("Decoded sentence:", decoded_sentence)</w:t>
+        <w:br/>
+        <w:t xml:space="preserve">        </w:t>
+      </w:r>
+      <w:r>
+        <w:rPr>
+          <w:i/>
+          <w:iCs/>
+        </w:rPr>
+        <w:t># 2. Оновлюємо стан для наступної ітерації</w:t>
+      </w:r>
+      <w:r>
+        <w:rPr>
+          <w:i/>
+          <w:iCs/>
+        </w:rPr>
+        <w:br/>
+        <w:t xml:space="preserve">        </w:t>
+      </w:r>
+      <w:r>
+        <w:t>states_value = h</w:t>
+      </w:r>
+      <w:r>
+        <w:br/>
+      </w:r>
+      <w:r>
+        <w:br/>
+        <w:t xml:space="preserve">    </w:t>
+      </w:r>
+      <w:r>
+        <w:rPr>
+          <w:i/>
+          <w:iCs/>
+        </w:rPr>
+        <w:t>print</w:t>
+      </w:r>
+      <w:r>
+        <w:t>("-")</w:t>
+      </w:r>
+      <w:r>
+        <w:br/>
+        <w:t xml:space="preserve">    </w:t>
+      </w:r>
+      <w:r>
+        <w:rPr>
+          <w:i/>
+          <w:iCs/>
+        </w:rPr>
+        <w:t>print</w:t>
+      </w:r>
+      <w:r>
+        <w:t>("Input sentence:", input_texts[seq_index])</w:t>
+      </w:r>
+      <w:r>
+        <w:br/>
+        <w:t xml:space="preserve">    </w:t>
+      </w:r>
+      <w:r>
+        <w:rPr>
+          <w:i/>
+          <w:iCs/>
+        </w:rPr>
+        <w:t>print</w:t>
+      </w:r>
+      <w:r>
+        <w:t>("Decoded sentence:", decoded_sentence)</w:t>
       </w:r>
     </w:p>
     <w:p>
       <w:pPr>
-        <w:rPr>
-          <w:lang w:val="uk-UA"/>
+        <w:spacing w:after="160" w:line="278" w:lineRule="auto"/>
+        <w:jc w:val="center"/>
+        <w:rPr>
+          <w:b/>
+          <w:i/>
+          <w:lang w:val="en-US"/>
         </w:rPr>
       </w:pPr>
     </w:p>
@@ -2187,31 +2850,25 @@
         <w:spacing w:after="160" w:line="278" w:lineRule="auto"/>
         <w:jc w:val="center"/>
         <w:rPr>
-          <w:rFonts w:ascii="Courier New" w:hAnsi="Courier New" w:cs="Courier New"/>
           <w:b/>
+          <w:i/>
+          <w:lang w:val="en-US"/>
+        </w:rPr>
+      </w:pPr>
+      <w:r>
+        <w:rPr>
+          <w:b/>
+          <w:i/>
           <w:noProof/>
-          <w:color w:val="000000" w:themeColor="text1"/>
-          <w:sz w:val="22"/>
-          <w:szCs w:val="22"/>
-          <w:lang w:val="uk-UA" w:eastAsia="en-GB"/>
-        </w:rPr>
-      </w:pPr>
-      <w:r>
-        <w:rPr>
-          <w:rFonts w:ascii="Courier New" w:hAnsi="Courier New" w:cs="Courier New"/>
-          <w:b/>
-          <w:noProof/>
-          <w:color w:val="000000" w:themeColor="text1"/>
-          <w:sz w:val="22"/>
-          <w:szCs w:val="22"/>
-          <w:lang w:val="uk-UA" w:eastAsia="en-GB"/>
+          <w:lang w:val="en-US"/>
           <w14:ligatures w14:val="standardContextual"/>
         </w:rPr>
+        <w:lastRenderedPageBreak/>
         <w:drawing>
           <wp:inline distT="0" distB="0" distL="0" distR="0">
-            <wp:extent cx="5911215" cy="2865120"/>
-            <wp:effectExtent l="0" t="0" r="0" b="5080"/>
-            <wp:docPr id="25217928" name="Picture 1" descr="A screenshot of a computer&#10;&#10;AI-generated content may be incorrect."/>
+            <wp:extent cx="4841507" cy="2082436"/>
+            <wp:effectExtent l="0" t="0" r="0" b="635"/>
+            <wp:docPr id="1963423246" name="Picture 1" descr="A screenshot of a computer&#10;&#10;AI-generated content may be incorrect."/>
             <wp:cNvGraphicFramePr>
               <a:graphicFrameLocks xmlns:a="http://schemas.openxmlformats.org/drawingml/2006/main" noChangeAspect="1"/>
             </wp:cNvGraphicFramePr>
@@ -2219,7 +2876,7 @@
               <a:graphicData uri="http://schemas.openxmlformats.org/drawingml/2006/picture">
                 <pic:pic xmlns:pic="http://schemas.openxmlformats.org/drawingml/2006/picture">
                   <pic:nvPicPr>
-                    <pic:cNvPr id="25217928" name="Picture 1" descr="A screenshot of a computer&#10;&#10;AI-generated content may be incorrect."/>
+                    <pic:cNvPr id="1963423246" name="Picture 1" descr="A screenshot of a computer&#10;&#10;AI-generated content may be incorrect."/>
                     <pic:cNvPicPr/>
                   </pic:nvPicPr>
                   <pic:blipFill>
@@ -2237,7 +2894,7 @@
                   <pic:spPr>
                     <a:xfrm>
                       <a:off x="0" y="0"/>
-                      <a:ext cx="5911215" cy="2865120"/>
+                      <a:ext cx="4878997" cy="2098561"/>
                     </a:xfrm>
                     <a:prstGeom prst="rect">
                       <a:avLst/>
@@ -2255,32 +2912,24 @@
         <w:spacing w:after="160" w:line="278" w:lineRule="auto"/>
         <w:jc w:val="center"/>
         <w:rPr>
-          <w:rFonts w:ascii="Courier New" w:hAnsi="Courier New" w:cs="Courier New"/>
           <w:b/>
+          <w:i/>
+          <w:lang w:val="en-US"/>
+        </w:rPr>
+      </w:pPr>
+      <w:r>
+        <w:rPr>
+          <w:b/>
+          <w:i/>
           <w:noProof/>
-          <w:color w:val="000000" w:themeColor="text1"/>
-          <w:sz w:val="22"/>
-          <w:szCs w:val="22"/>
-          <w:lang w:val="uk-UA" w:eastAsia="en-GB"/>
-        </w:rPr>
-      </w:pPr>
-      <w:r>
-        <w:rPr>
-          <w:rFonts w:ascii="Courier New" w:hAnsi="Courier New" w:cs="Courier New"/>
-          <w:b/>
-          <w:noProof/>
-          <w:color w:val="000000" w:themeColor="text1"/>
-          <w:sz w:val="22"/>
-          <w:szCs w:val="22"/>
-          <w:lang w:val="uk-UA" w:eastAsia="en-GB"/>
+          <w:lang w:val="en-US"/>
           <w14:ligatures w14:val="standardContextual"/>
         </w:rPr>
-        <w:lastRenderedPageBreak/>
         <w:drawing>
           <wp:inline distT="0" distB="0" distL="0" distR="0">
-            <wp:extent cx="5911215" cy="5789930"/>
-            <wp:effectExtent l="0" t="0" r="0" b="1270"/>
-            <wp:docPr id="1347275844" name="Picture 2" descr="A screenshot of a computer&#10;&#10;AI-generated content may be incorrect."/>
+            <wp:extent cx="4802740" cy="1501340"/>
+            <wp:effectExtent l="0" t="0" r="0" b="0"/>
+            <wp:docPr id="1972249013" name="Picture 2" descr="A screenshot of a computer&#10;&#10;AI-generated content may be incorrect."/>
             <wp:cNvGraphicFramePr>
               <a:graphicFrameLocks xmlns:a="http://schemas.openxmlformats.org/drawingml/2006/main" noChangeAspect="1"/>
             </wp:cNvGraphicFramePr>
@@ -2288,11 +2937,11 @@
               <a:graphicData uri="http://schemas.openxmlformats.org/drawingml/2006/picture">
                 <pic:pic xmlns:pic="http://schemas.openxmlformats.org/drawingml/2006/picture">
                   <pic:nvPicPr>
-                    <pic:cNvPr id="1347275844" name="Picture 2" descr="A screenshot of a computer&#10;&#10;AI-generated content may be incorrect."/>
+                    <pic:cNvPr id="1972249013" name="Picture 2" descr="A screenshot of a computer&#10;&#10;AI-generated content may be incorrect."/>
                     <pic:cNvPicPr/>
                   </pic:nvPicPr>
                   <pic:blipFill>
-                    <a:blip r:embed="rId6">
+                    <a:blip r:embed="rId6" cstate="print">
                       <a:extLst>
                         <a:ext uri="{28A0092B-C50C-407E-A947-70E740481C1C}">
                           <a14:useLocalDpi xmlns:a14="http://schemas.microsoft.com/office/drawing/2010/main" val="0"/>
@@ -2306,7 +2955,7 @@
                   <pic:spPr>
                     <a:xfrm>
                       <a:off x="0" y="0"/>
-                      <a:ext cx="5911215" cy="5789930"/>
+                      <a:ext cx="4812153" cy="1504282"/>
                     </a:xfrm>
                     <a:prstGeom prst="rect">
                       <a:avLst/>
@@ -2318,348 +2967,122 @@
           </wp:inline>
         </w:drawing>
       </w:r>
+      <w:r>
+        <w:rPr>
+          <w:b/>
+          <w:i/>
+          <w:lang w:val="en-US"/>
+        </w:rPr>
+        <w:br w:type="page"/>
+      </w:r>
     </w:p>
     <w:p>
       <w:pPr>
-        <w:spacing w:after="160" w:line="278" w:lineRule="auto"/>
-        <w:rPr>
-          <w:rFonts w:ascii="Courier New" w:hAnsi="Courier New" w:cs="Courier New"/>
+        <w:numPr>
+          <w:ilvl w:val="0"/>
+          <w:numId w:val="19"/>
+        </w:numPr>
+        <w:spacing w:line="360" w:lineRule="auto"/>
+        <w:rPr>
           <w:b/>
-          <w:noProof/>
-          <w:color w:val="000000" w:themeColor="text1"/>
-          <w:sz w:val="22"/>
-          <w:szCs w:val="22"/>
-          <w:lang w:val="uk-UA" w:eastAsia="en-GB"/>
-        </w:rPr>
-      </w:pPr>
-      <w:r>
-        <w:rPr>
-          <w:rFonts w:ascii="Courier New" w:hAnsi="Courier New" w:cs="Courier New"/>
+          <w:i/>
+          <w:lang w:val="uk-UA"/>
+        </w:rPr>
+      </w:pPr>
+      <w:r>
+        <w:rPr>
           <w:b/>
-          <w:noProof/>
-          <w:color w:val="000000" w:themeColor="text1"/>
-          <w:sz w:val="22"/>
-          <w:szCs w:val="22"/>
-          <w:lang w:val="uk-UA" w:eastAsia="en-GB"/>
-        </w:rPr>
-        <w:br w:type="page"/>
+          <w:i/>
+          <w:lang w:val="uk-UA"/>
+        </w:rPr>
+        <w:lastRenderedPageBreak/>
+        <w:t>Висновки</w:t>
+      </w:r>
+      <w:r>
+        <w:rPr>
+          <w:b/>
+          <w:i/>
+          <w:lang w:val="en-US"/>
+        </w:rPr>
+        <w:t>:</w:t>
       </w:r>
     </w:p>
     <w:p>
       <w:pPr>
-        <w:pStyle w:val="ListParagraph"/>
-        <w:numPr>
-          <w:ilvl w:val="0"/>
-          <w:numId w:val="1"/>
-        </w:numPr>
-        <w:spacing w:line="360" w:lineRule="auto"/>
-        <w:rPr>
-          <w:b/>
-          <w:bCs/>
-          <w:i/>
-          <w:iCs/>
-          <w:lang w:val="uk-UA"/>
-        </w:rPr>
-      </w:pPr>
-      <w:r>
-        <w:rPr>
-          <w:b/>
-          <w:bCs/>
-          <w:i/>
-          <w:iCs/>
-          <w:lang w:val="uk-UA"/>
-        </w:rPr>
-        <w:lastRenderedPageBreak/>
-        <w:t>Висновки.</w:t>
+        <w:pStyle w:val="Normal15"/>
+        <w:ind w:firstLine="720"/>
+      </w:pPr>
+      <w:r>
+        <w:t xml:space="preserve">Під час виконання лабораторної роботи я реалізував нейромережу Seq2seq на базі </w:t>
+      </w:r>
+      <w:r>
+        <w:rPr>
+          <w:rStyle w:val="HTMLCode"/>
+          <w:rFonts w:eastAsiaTheme="majorEastAsia"/>
+        </w:rPr>
+        <w:t>GRU</w:t>
+      </w:r>
+      <w:r>
+        <w:t xml:space="preserve">. На відміну від </w:t>
+      </w:r>
+      <w:r>
+        <w:rPr>
+          <w:rStyle w:val="HTMLCode"/>
+          <w:rFonts w:eastAsiaTheme="majorEastAsia"/>
+        </w:rPr>
+        <w:t>SimpleRNN</w:t>
+      </w:r>
+      <w:r>
+        <w:t xml:space="preserve"> (з Лаб. 3), шари </w:t>
+      </w:r>
+      <w:r>
+        <w:rPr>
+          <w:rStyle w:val="HTMLCode"/>
+          <w:rFonts w:eastAsiaTheme="majorEastAsia"/>
+        </w:rPr>
+        <w:t>GRU</w:t>
+      </w:r>
+      <w:r>
+        <w:t xml:space="preserve"> містять механізми "вентилів" (update gate та reset gate), які дозволяють моделі краще контролювати потік інформації та ефективніше навчатися довгостроковим залежностям у тексті.</w:t>
       </w:r>
     </w:p>
     <w:p>
       <w:pPr>
-        <w:spacing w:line="360" w:lineRule="auto"/>
+        <w:pStyle w:val="Normal15"/>
         <w:ind w:firstLine="720"/>
-        <w:rPr>
-          <w:lang w:val="uk-UA" w:eastAsia="en-GB"/>
-        </w:rPr>
-      </w:pPr>
-      <w:r>
-        <w:rPr>
-          <w:lang w:val="uk-UA"/>
-        </w:rPr>
-        <w:t xml:space="preserve">Під час виконання лабораторної роботи я реалізував </w:t>
-      </w:r>
-      <w:proofErr w:type="spellStart"/>
-      <w:r>
-        <w:rPr>
-          <w:lang w:val="uk-UA"/>
-        </w:rPr>
-        <w:t>нейромережу</w:t>
-      </w:r>
-      <w:proofErr w:type="spellEnd"/>
-      <w:r>
-        <w:rPr>
-          <w:lang w:val="uk-UA"/>
-        </w:rPr>
-        <w:t xml:space="preserve"> Seq2seq на базі </w:t>
+      </w:pPr>
+      <w:r>
+        <w:t xml:space="preserve">При навчанні моделі протягом 50 епох (n=50) було помітно, що </w:t>
       </w:r>
       <w:r>
         <w:rPr>
           <w:rStyle w:val="HTMLCode"/>
           <w:rFonts w:eastAsiaTheme="majorEastAsia"/>
-          <w:lang w:val="uk-UA"/>
-        </w:rPr>
-        <w:t>LSTM</w:t>
-      </w:r>
-      <w:r>
-        <w:rPr>
-          <w:lang w:val="uk-UA"/>
-        </w:rPr>
-        <w:t xml:space="preserve">. </w:t>
+        </w:rPr>
+        <w:t>GRU</w:t>
+      </w:r>
+      <w:r>
+        <w:t xml:space="preserve"> показує кращу якість перекладу порівняно з </w:t>
       </w:r>
       <w:r>
         <w:rPr>
           <w:rStyle w:val="HTMLCode"/>
           <w:rFonts w:eastAsiaTheme="majorEastAsia"/>
-          <w:lang w:val="uk-UA"/>
-        </w:rPr>
-        <w:t>LSTM</w:t>
-      </w:r>
-      <w:r>
-        <w:rPr>
-          <w:lang w:val="uk-UA"/>
-        </w:rPr>
-        <w:t xml:space="preserve"> є ще більш складною архітектурою, ніж </w:t>
+        </w:rPr>
+        <w:t>SimpleRNN</w:t>
+      </w:r>
+      <w:r>
+        <w:t xml:space="preserve"> за ту саму кількість епох. Модель генерує більш точні та повні речення, що свідчить про перевагу </w:t>
       </w:r>
       <w:r>
         <w:rPr>
           <w:rStyle w:val="HTMLCode"/>
           <w:rFonts w:eastAsiaTheme="majorEastAsia"/>
-          <w:lang w:val="uk-UA"/>
         </w:rPr>
         <w:t>GRU</w:t>
       </w:r>
       <w:r>
-        <w:rPr>
-          <w:lang w:val="uk-UA"/>
-        </w:rPr>
-        <w:t>, оскільки використовує три "вентилі" (</w:t>
-      </w:r>
-      <w:proofErr w:type="spellStart"/>
-      <w:r>
-        <w:rPr>
-          <w:lang w:val="uk-UA"/>
-        </w:rPr>
-        <w:t>forget</w:t>
-      </w:r>
-      <w:proofErr w:type="spellEnd"/>
-      <w:r>
-        <w:rPr>
-          <w:lang w:val="uk-UA"/>
-        </w:rPr>
-        <w:t xml:space="preserve">, </w:t>
-      </w:r>
-      <w:proofErr w:type="spellStart"/>
-      <w:r>
-        <w:rPr>
-          <w:lang w:val="uk-UA"/>
-        </w:rPr>
-        <w:t>input</w:t>
-      </w:r>
-      <w:proofErr w:type="spellEnd"/>
-      <w:r>
-        <w:rPr>
-          <w:lang w:val="uk-UA"/>
-        </w:rPr>
-        <w:t xml:space="preserve">, </w:t>
-      </w:r>
-      <w:proofErr w:type="spellStart"/>
-      <w:r>
-        <w:rPr>
-          <w:lang w:val="uk-UA"/>
-        </w:rPr>
-        <w:t>output</w:t>
-      </w:r>
-      <w:proofErr w:type="spellEnd"/>
-      <w:r>
-        <w:rPr>
-          <w:lang w:val="uk-UA"/>
-        </w:rPr>
-        <w:t>) та окремий "стан комірки" (</w:t>
-      </w:r>
-      <w:proofErr w:type="spellStart"/>
-      <w:r>
-        <w:rPr>
-          <w:rStyle w:val="HTMLCode"/>
-          <w:rFonts w:eastAsiaTheme="majorEastAsia"/>
-          <w:lang w:val="uk-UA"/>
-        </w:rPr>
-        <w:t>c_state</w:t>
-      </w:r>
-      <w:proofErr w:type="spellEnd"/>
-      <w:r>
-        <w:rPr>
-          <w:lang w:val="uk-UA"/>
-        </w:rPr>
-        <w:t>) на додачу до прихованого стану (</w:t>
-      </w:r>
-      <w:proofErr w:type="spellStart"/>
-      <w:r>
-        <w:rPr>
-          <w:rStyle w:val="HTMLCode"/>
-          <w:rFonts w:eastAsiaTheme="majorEastAsia"/>
-          <w:lang w:val="uk-UA"/>
-        </w:rPr>
-        <w:t>h_state</w:t>
-      </w:r>
-      <w:proofErr w:type="spellEnd"/>
-      <w:r>
-        <w:rPr>
-          <w:lang w:val="uk-UA"/>
-        </w:rPr>
-        <w:t>).</w:t>
-      </w:r>
-    </w:p>
-    <w:p>
-      <w:pPr>
-        <w:spacing w:line="360" w:lineRule="auto"/>
-        <w:ind w:firstLine="720"/>
-        <w:rPr>
-          <w:lang w:val="uk-UA"/>
-        </w:rPr>
-      </w:pPr>
-      <w:r>
-        <w:rPr>
-          <w:lang w:val="uk-UA"/>
-        </w:rPr>
-        <w:t>Ця розділена пам'ять (</w:t>
-      </w:r>
-      <w:proofErr w:type="spellStart"/>
-      <w:r>
-        <w:rPr>
-          <w:rStyle w:val="HTMLCode"/>
-          <w:rFonts w:eastAsiaTheme="majorEastAsia"/>
-          <w:lang w:val="uk-UA"/>
-        </w:rPr>
-        <w:t>c_state</w:t>
-      </w:r>
-      <w:proofErr w:type="spellEnd"/>
-      <w:r>
-        <w:rPr>
-          <w:lang w:val="uk-UA"/>
-        </w:rPr>
-        <w:t xml:space="preserve">) дозволяє </w:t>
-      </w:r>
-      <w:r>
-        <w:rPr>
-          <w:rStyle w:val="HTMLCode"/>
-          <w:rFonts w:eastAsiaTheme="majorEastAsia"/>
-          <w:lang w:val="uk-UA"/>
-        </w:rPr>
-        <w:t>LSTM</w:t>
-      </w:r>
-      <w:r>
-        <w:rPr>
-          <w:lang w:val="uk-UA"/>
-        </w:rPr>
-        <w:t xml:space="preserve"> ще ефективніше, ніж </w:t>
-      </w:r>
-      <w:r>
-        <w:rPr>
-          <w:rStyle w:val="HTMLCode"/>
-          <w:rFonts w:eastAsiaTheme="majorEastAsia"/>
-          <w:lang w:val="uk-UA"/>
-        </w:rPr>
-        <w:t>GRU</w:t>
-      </w:r>
-      <w:r>
-        <w:rPr>
-          <w:lang w:val="uk-UA"/>
-        </w:rPr>
-        <w:t xml:space="preserve">, керувати довгостроковими </w:t>
-      </w:r>
-      <w:proofErr w:type="spellStart"/>
-      <w:r>
-        <w:rPr>
-          <w:lang w:val="uk-UA"/>
-        </w:rPr>
-        <w:t>залежностями</w:t>
-      </w:r>
-      <w:proofErr w:type="spellEnd"/>
-      <w:r>
-        <w:rPr>
-          <w:lang w:val="uk-UA"/>
-        </w:rPr>
-        <w:t xml:space="preserve"> та "пам'ятати" або "забувати" інформацію протягом довгих послідовностей.</w:t>
-      </w:r>
-    </w:p>
-    <w:p>
-      <w:pPr>
-        <w:spacing w:line="360" w:lineRule="auto"/>
-        <w:ind w:firstLine="720"/>
-        <w:rPr>
-          <w:lang w:val="uk-UA"/>
-        </w:rPr>
-      </w:pPr>
-      <w:r>
-        <w:rPr>
-          <w:lang w:val="uk-UA"/>
-        </w:rPr>
-        <w:t xml:space="preserve">При навчанні протягом 50 епох модель </w:t>
-      </w:r>
-      <w:r>
-        <w:rPr>
-          <w:rStyle w:val="HTMLCode"/>
-          <w:rFonts w:eastAsiaTheme="majorEastAsia"/>
-          <w:lang w:val="uk-UA"/>
-        </w:rPr>
-        <w:t>LSTM</w:t>
-      </w:r>
-      <w:r>
-        <w:rPr>
-          <w:lang w:val="uk-UA"/>
-        </w:rPr>
-        <w:t xml:space="preserve"> показала результати, порівнянні або дещо кращі за </w:t>
-      </w:r>
-      <w:r>
-        <w:rPr>
-          <w:rStyle w:val="HTMLCode"/>
-          <w:rFonts w:eastAsiaTheme="majorEastAsia"/>
-          <w:lang w:val="uk-UA"/>
-        </w:rPr>
-        <w:t>GRU</w:t>
-      </w:r>
-      <w:r>
-        <w:rPr>
-          <w:lang w:val="uk-UA"/>
-        </w:rPr>
-        <w:t xml:space="preserve">. Вона вважається найнадійнішою, хоч і </w:t>
-      </w:r>
-      <w:proofErr w:type="spellStart"/>
-      <w:r>
-        <w:rPr>
-          <w:lang w:val="uk-UA"/>
-        </w:rPr>
-        <w:t>обчислювально</w:t>
-      </w:r>
-      <w:proofErr w:type="spellEnd"/>
-      <w:r>
-        <w:rPr>
-          <w:lang w:val="uk-UA"/>
-        </w:rPr>
-        <w:t xml:space="preserve"> </w:t>
-      </w:r>
-      <w:proofErr w:type="spellStart"/>
-      <w:r>
-        <w:rPr>
-          <w:lang w:val="uk-UA"/>
-        </w:rPr>
-        <w:t>найвитратнішою</w:t>
-      </w:r>
-      <w:proofErr w:type="spellEnd"/>
-      <w:r>
-        <w:rPr>
-          <w:lang w:val="uk-UA"/>
-        </w:rPr>
-        <w:t>, базовою рекурентною архітектурою для задач Seq2seq. Завдання лабораторної роботи було виконано.</w:t>
+        <w:t xml:space="preserve"> у вирішенні задач обробки послідовностей. Завдання лабораторної роботи було виконано, код було виправлено у місцях логічних помилок, присутніх у наданому прикладі.</w:t>
       </w:r>
     </w:p>
     <w:sectPr>
@@ -3048,6 +3471,92 @@
     </w:lvl>
   </w:abstractNum>
   <w:abstractNum w:abstractNumId="4" w15:restartNumberingAfterBreak="0">
+    <w:nsid w:val="15324C7E"/>
+    <w:multiLevelType w:val="hybridMultilevel"/>
+    <w:tmpl w:val="D870F0C8"/>
+    <w:lvl w:ilvl="0" w:tplc="0419000F">
+      <w:start w:val="1"/>
+      <w:numFmt w:val="decimal"/>
+      <w:lvlText w:val="%1."/>
+      <w:lvlJc w:val="left"/>
+      <w:pPr>
+        <w:ind w:left="1440" w:hanging="360"/>
+      </w:pPr>
+    </w:lvl>
+    <w:lvl w:ilvl="1" w:tplc="0809000F">
+      <w:start w:val="1"/>
+      <w:numFmt w:val="decimal"/>
+      <w:lvlText w:val="%2."/>
+      <w:lvlJc w:val="left"/>
+      <w:pPr>
+        <w:ind w:left="2160" w:hanging="360"/>
+      </w:pPr>
+    </w:lvl>
+    <w:lvl w:ilvl="2" w:tplc="0809001B" w:tentative="1">
+      <w:start w:val="1"/>
+      <w:numFmt w:val="lowerRoman"/>
+      <w:lvlText w:val="%3."/>
+      <w:lvlJc w:val="right"/>
+      <w:pPr>
+        <w:ind w:left="2880" w:hanging="180"/>
+      </w:pPr>
+    </w:lvl>
+    <w:lvl w:ilvl="3" w:tplc="0809000F" w:tentative="1">
+      <w:start w:val="1"/>
+      <w:numFmt w:val="decimal"/>
+      <w:lvlText w:val="%4."/>
+      <w:lvlJc w:val="left"/>
+      <w:pPr>
+        <w:ind w:left="3600" w:hanging="360"/>
+      </w:pPr>
+    </w:lvl>
+    <w:lvl w:ilvl="4" w:tplc="08090019" w:tentative="1">
+      <w:start w:val="1"/>
+      <w:numFmt w:val="lowerLetter"/>
+      <w:lvlText w:val="%5."/>
+      <w:lvlJc w:val="left"/>
+      <w:pPr>
+        <w:ind w:left="4320" w:hanging="360"/>
+      </w:pPr>
+    </w:lvl>
+    <w:lvl w:ilvl="5" w:tplc="0809001B" w:tentative="1">
+      <w:start w:val="1"/>
+      <w:numFmt w:val="lowerRoman"/>
+      <w:lvlText w:val="%6."/>
+      <w:lvlJc w:val="right"/>
+      <w:pPr>
+        <w:ind w:left="5040" w:hanging="180"/>
+      </w:pPr>
+    </w:lvl>
+    <w:lvl w:ilvl="6" w:tplc="0809000F" w:tentative="1">
+      <w:start w:val="1"/>
+      <w:numFmt w:val="decimal"/>
+      <w:lvlText w:val="%7."/>
+      <w:lvlJc w:val="left"/>
+      <w:pPr>
+        <w:ind w:left="5760" w:hanging="360"/>
+      </w:pPr>
+    </w:lvl>
+    <w:lvl w:ilvl="7" w:tplc="08090019" w:tentative="1">
+      <w:start w:val="1"/>
+      <w:numFmt w:val="lowerLetter"/>
+      <w:lvlText w:val="%8."/>
+      <w:lvlJc w:val="left"/>
+      <w:pPr>
+        <w:ind w:left="6480" w:hanging="360"/>
+      </w:pPr>
+    </w:lvl>
+    <w:lvl w:ilvl="8" w:tplc="0809001B" w:tentative="1">
+      <w:start w:val="1"/>
+      <w:numFmt w:val="lowerRoman"/>
+      <w:lvlText w:val="%9."/>
+      <w:lvlJc w:val="right"/>
+      <w:pPr>
+        <w:ind w:left="7200" w:hanging="180"/>
+      </w:pPr>
+    </w:lvl>
+  </w:abstractNum>
+  <w:abstractNum w:abstractNumId="5" w15:restartNumberingAfterBreak="0">
     <w:nsid w:val="1AAF5A03"/>
     <w:multiLevelType w:val="hybridMultilevel"/>
     <w:tmpl w:val="4B80C832"/>
@@ -3133,7 +3642,7 @@
       </w:pPr>
     </w:lvl>
   </w:abstractNum>
-  <w:abstractNum w:abstractNumId="5" w15:restartNumberingAfterBreak="0">
+  <w:abstractNum w:abstractNumId="6" w15:restartNumberingAfterBreak="0">
     <w:nsid w:val="1AD1035C"/>
     <w:multiLevelType w:val="multilevel"/>
     <w:tmpl w:val="2CFE8D4C"/>
@@ -3246,7 +3755,7 @@
       </w:pPr>
     </w:lvl>
   </w:abstractNum>
-  <w:abstractNum w:abstractNumId="6" w15:restartNumberingAfterBreak="0">
+  <w:abstractNum w:abstractNumId="7" w15:restartNumberingAfterBreak="0">
     <w:nsid w:val="1D0C10CB"/>
     <w:multiLevelType w:val="hybridMultilevel"/>
     <w:tmpl w:val="56C4F18A"/>
@@ -3352,7 +3861,7 @@
       </w:pPr>
     </w:lvl>
   </w:abstractNum>
-  <w:abstractNum w:abstractNumId="7" w15:restartNumberingAfterBreak="0">
+  <w:abstractNum w:abstractNumId="8" w15:restartNumberingAfterBreak="0">
     <w:nsid w:val="284C19DB"/>
     <w:multiLevelType w:val="hybridMultilevel"/>
     <w:tmpl w:val="52CCE902"/>
@@ -3458,7 +3967,7 @@
       </w:pPr>
     </w:lvl>
   </w:abstractNum>
-  <w:abstractNum w:abstractNumId="8" w15:restartNumberingAfterBreak="0">
+  <w:abstractNum w:abstractNumId="9" w15:restartNumberingAfterBreak="0">
     <w:nsid w:val="284D3A82"/>
     <w:multiLevelType w:val="hybridMultilevel"/>
     <w:tmpl w:val="3EE690EC"/>
@@ -3564,7 +4073,7 @@
       </w:pPr>
     </w:lvl>
   </w:abstractNum>
-  <w:abstractNum w:abstractNumId="9" w15:restartNumberingAfterBreak="0">
+  <w:abstractNum w:abstractNumId="10" w15:restartNumberingAfterBreak="0">
     <w:nsid w:val="2B4F2E45"/>
     <w:multiLevelType w:val="hybridMultilevel"/>
     <w:tmpl w:val="C17A0052"/>
@@ -3650,7 +4159,7 @@
       </w:pPr>
     </w:lvl>
   </w:abstractNum>
-  <w:abstractNum w:abstractNumId="10" w15:restartNumberingAfterBreak="0">
+  <w:abstractNum w:abstractNumId="11" w15:restartNumberingAfterBreak="0">
     <w:nsid w:val="353B5C97"/>
     <w:multiLevelType w:val="hybridMultilevel"/>
     <w:tmpl w:val="6A0E36B0"/>
@@ -3739,7 +4248,7 @@
       </w:pPr>
     </w:lvl>
   </w:abstractNum>
-  <w:abstractNum w:abstractNumId="11" w15:restartNumberingAfterBreak="0">
+  <w:abstractNum w:abstractNumId="12" w15:restartNumberingAfterBreak="0">
     <w:nsid w:val="3E3125C6"/>
     <w:multiLevelType w:val="multilevel"/>
     <w:tmpl w:val="99F029A8"/>
@@ -3852,11 +4361,97 @@
       </w:pPr>
     </w:lvl>
   </w:abstractNum>
-  <w:abstractNum w:abstractNumId="12" w15:restartNumberingAfterBreak="0">
+  <w:abstractNum w:abstractNumId="13" w15:restartNumberingAfterBreak="0">
+    <w:nsid w:val="50E36572"/>
+    <w:multiLevelType w:val="hybridMultilevel"/>
+    <w:tmpl w:val="35AA1C3E"/>
+    <w:lvl w:ilvl="0" w:tplc="0419000F">
+      <w:start w:val="1"/>
+      <w:numFmt w:val="decimal"/>
+      <w:lvlText w:val="%1."/>
+      <w:lvlJc w:val="left"/>
+      <w:pPr>
+        <w:ind w:left="1080" w:hanging="360"/>
+      </w:pPr>
+    </w:lvl>
+    <w:lvl w:ilvl="1" w:tplc="08090019" w:tentative="1">
+      <w:start w:val="1"/>
+      <w:numFmt w:val="lowerLetter"/>
+      <w:lvlText w:val="%2."/>
+      <w:lvlJc w:val="left"/>
+      <w:pPr>
+        <w:ind w:left="1800" w:hanging="360"/>
+      </w:pPr>
+    </w:lvl>
+    <w:lvl w:ilvl="2" w:tplc="0809001B" w:tentative="1">
+      <w:start w:val="1"/>
+      <w:numFmt w:val="lowerRoman"/>
+      <w:lvlText w:val="%3."/>
+      <w:lvlJc w:val="right"/>
+      <w:pPr>
+        <w:ind w:left="2520" w:hanging="180"/>
+      </w:pPr>
+    </w:lvl>
+    <w:lvl w:ilvl="3" w:tplc="0809000F" w:tentative="1">
+      <w:start w:val="1"/>
+      <w:numFmt w:val="decimal"/>
+      <w:lvlText w:val="%4."/>
+      <w:lvlJc w:val="left"/>
+      <w:pPr>
+        <w:ind w:left="3240" w:hanging="360"/>
+      </w:pPr>
+    </w:lvl>
+    <w:lvl w:ilvl="4" w:tplc="08090019" w:tentative="1">
+      <w:start w:val="1"/>
+      <w:numFmt w:val="lowerLetter"/>
+      <w:lvlText w:val="%5."/>
+      <w:lvlJc w:val="left"/>
+      <w:pPr>
+        <w:ind w:left="3960" w:hanging="360"/>
+      </w:pPr>
+    </w:lvl>
+    <w:lvl w:ilvl="5" w:tplc="0809001B" w:tentative="1">
+      <w:start w:val="1"/>
+      <w:numFmt w:val="lowerRoman"/>
+      <w:lvlText w:val="%6."/>
+      <w:lvlJc w:val="right"/>
+      <w:pPr>
+        <w:ind w:left="4680" w:hanging="180"/>
+      </w:pPr>
+    </w:lvl>
+    <w:lvl w:ilvl="6" w:tplc="0809000F" w:tentative="1">
+      <w:start w:val="1"/>
+      <w:numFmt w:val="decimal"/>
+      <w:lvlText w:val="%7."/>
+      <w:lvlJc w:val="left"/>
+      <w:pPr>
+        <w:ind w:left="5400" w:hanging="360"/>
+      </w:pPr>
+    </w:lvl>
+    <w:lvl w:ilvl="7" w:tplc="08090019" w:tentative="1">
+      <w:start w:val="1"/>
+      <w:numFmt w:val="lowerLetter"/>
+      <w:lvlText w:val="%8."/>
+      <w:lvlJc w:val="left"/>
+      <w:pPr>
+        <w:ind w:left="6120" w:hanging="360"/>
+      </w:pPr>
+    </w:lvl>
+    <w:lvl w:ilvl="8" w:tplc="0809001B" w:tentative="1">
+      <w:start w:val="1"/>
+      <w:numFmt w:val="lowerRoman"/>
+      <w:lvlText w:val="%9."/>
+      <w:lvlJc w:val="right"/>
+      <w:pPr>
+        <w:ind w:left="6840" w:hanging="180"/>
+      </w:pPr>
+    </w:lvl>
+  </w:abstractNum>
+  <w:abstractNum w:abstractNumId="14" w15:restartNumberingAfterBreak="0">
     <w:nsid w:val="57650F01"/>
     <w:multiLevelType w:val="hybridMultilevel"/>
-    <w:tmpl w:val="5EE8466E"/>
-    <w:lvl w:ilvl="0" w:tplc="0419000F">
+    <w:tmpl w:val="3E3AB108"/>
+    <w:lvl w:ilvl="0" w:tplc="0212A50C">
       <w:start w:val="1"/>
       <w:numFmt w:val="decimal"/>
       <w:lvlText w:val="%1."/>
@@ -3864,6 +4459,10 @@
       <w:pPr>
         <w:ind w:left="1080" w:hanging="360"/>
       </w:pPr>
+      <w:rPr>
+        <w:b/>
+        <w:bCs/>
+      </w:rPr>
     </w:lvl>
     <w:lvl w:ilvl="1" w:tplc="04190019">
       <w:start w:val="1"/>
@@ -3961,7 +4560,7 @@
       </w:pPr>
     </w:lvl>
   </w:abstractNum>
-  <w:abstractNum w:abstractNumId="13" w15:restartNumberingAfterBreak="0">
+  <w:abstractNum w:abstractNumId="15" w15:restartNumberingAfterBreak="0">
     <w:nsid w:val="63DF3DD6"/>
     <w:multiLevelType w:val="hybridMultilevel"/>
     <w:tmpl w:val="BB78944E"/>
@@ -4050,7 +4649,7 @@
       </w:pPr>
     </w:lvl>
   </w:abstractNum>
-  <w:abstractNum w:abstractNumId="14" w15:restartNumberingAfterBreak="0">
+  <w:abstractNum w:abstractNumId="16" w15:restartNumberingAfterBreak="0">
     <w:nsid w:val="6B852497"/>
     <w:multiLevelType w:val="hybridMultilevel"/>
     <w:tmpl w:val="C2D28696"/>
@@ -4136,7 +4735,7 @@
       </w:pPr>
     </w:lvl>
   </w:abstractNum>
-  <w:abstractNum w:abstractNumId="15" w15:restartNumberingAfterBreak="0">
+  <w:abstractNum w:abstractNumId="17" w15:restartNumberingAfterBreak="0">
     <w:nsid w:val="759C30C1"/>
     <w:multiLevelType w:val="hybridMultilevel"/>
     <w:tmpl w:val="B470C012"/>
@@ -4222,7 +4821,7 @@
       </w:pPr>
     </w:lvl>
   </w:abstractNum>
-  <w:abstractNum w:abstractNumId="16" w15:restartNumberingAfterBreak="0">
+  <w:abstractNum w:abstractNumId="18" w15:restartNumberingAfterBreak="0">
     <w:nsid w:val="76AF6A1D"/>
     <w:multiLevelType w:val="hybridMultilevel"/>
     <w:tmpl w:val="8230F946"/>
@@ -4333,40 +4932,40 @@
     </w:lvl>
   </w:abstractNum>
   <w:num w:numId="1" w16cid:durableId="1993362585">
-    <w:abstractNumId w:val="12"/>
+    <w:abstractNumId w:val="14"/>
   </w:num>
   <w:num w:numId="2" w16cid:durableId="1562406540">
-    <w:abstractNumId w:val="10"/>
+    <w:abstractNumId w:val="11"/>
   </w:num>
   <w:num w:numId="3" w16cid:durableId="718096523">
-    <w:abstractNumId w:val="16"/>
+    <w:abstractNumId w:val="18"/>
   </w:num>
   <w:num w:numId="4" w16cid:durableId="17048782">
-    <w:abstractNumId w:val="5"/>
+    <w:abstractNumId w:val="6"/>
   </w:num>
   <w:num w:numId="5" w16cid:durableId="1798141542">
     <w:abstractNumId w:val="1"/>
   </w:num>
   <w:num w:numId="6" w16cid:durableId="1150367456">
-    <w:abstractNumId w:val="14"/>
+    <w:abstractNumId w:val="16"/>
   </w:num>
   <w:num w:numId="7" w16cid:durableId="845634757">
     <w:abstractNumId w:val="2"/>
   </w:num>
   <w:num w:numId="8" w16cid:durableId="1245263617">
-    <w:abstractNumId w:val="9"/>
+    <w:abstractNumId w:val="10"/>
   </w:num>
   <w:num w:numId="9" w16cid:durableId="2023239016">
-    <w:abstractNumId w:val="4"/>
+    <w:abstractNumId w:val="5"/>
   </w:num>
   <w:num w:numId="10" w16cid:durableId="151485683">
+    <w:abstractNumId w:val="17"/>
+  </w:num>
+  <w:num w:numId="11" w16cid:durableId="1855027343">
     <w:abstractNumId w:val="15"/>
   </w:num>
-  <w:num w:numId="11" w16cid:durableId="1855027343">
-    <w:abstractNumId w:val="13"/>
-  </w:num>
   <w:num w:numId="12" w16cid:durableId="775444331">
-    <w:abstractNumId w:val="11"/>
+    <w:abstractNumId w:val="12"/>
   </w:num>
   <w:num w:numId="13" w16cid:durableId="1614097860">
     <w:abstractNumId w:val="3"/>
@@ -4375,13 +4974,19 @@
     <w:abstractNumId w:val="0"/>
   </w:num>
   <w:num w:numId="15" w16cid:durableId="1547643994">
-    <w:abstractNumId w:val="6"/>
+    <w:abstractNumId w:val="7"/>
   </w:num>
   <w:num w:numId="16" w16cid:durableId="1287810656">
+    <w:abstractNumId w:val="9"/>
+  </w:num>
+  <w:num w:numId="17" w16cid:durableId="499735839">
     <w:abstractNumId w:val="8"/>
   </w:num>
-  <w:num w:numId="17" w16cid:durableId="499735839">
-    <w:abstractNumId w:val="7"/>
+  <w:num w:numId="18" w16cid:durableId="778911773">
+    <w:abstractNumId w:val="13"/>
+  </w:num>
+  <w:num w:numId="19" w16cid:durableId="1775203773">
+    <w:abstractNumId w:val="4"/>
   </w:num>
 </w:numbering>
 </file>
@@ -5454,6 +6059,15 @@
       <w:lang w:val="en-GB" w:eastAsia="en-GB"/>
     </w:rPr>
   </w:style>
+  <w:style w:type="paragraph" w:customStyle="1" w:styleId="Normal15">
+    <w:name w:val="Normal 1.5"/>
+    <w:basedOn w:val="NormalWeb"/>
+    <w:qFormat/>
+    <w:rsid w:val="0004250C"/>
+    <w:pPr>
+      <w:spacing w:before="0" w:beforeAutospacing="0" w:after="0" w:afterAutospacing="0" w:line="360" w:lineRule="auto"/>
+    </w:pPr>
+  </w:style>
 </w:styles>
 </file>
 

</xml_diff>